<commit_message>
Part3.2_Dynamic Load Balancing with consul
</commit_message>
<xml_diff>
--- a/Course2/ProjectDocs/Part3-Load_Balancing.docx
+++ b/Course2/ProjectDocs/Part3-Load_Balancing.docx
@@ -106,15 +106,7 @@
                               <w:jc w:val="center"/>
                             </w:pPr>
                             <w:r>
-                              <w:t>(</w:t>
-                            </w:r>
-                            <w:proofErr w:type="spellStart"/>
-                            <w:r>
-                              <w:t>infytel</w:t>
-                            </w:r>
-                            <w:proofErr w:type="spellEnd"/>
-                            <w:r>
-                              <w:t>-friend-family)</w:t>
+                              <w:t>(infytel-friend-family)</w:t>
                             </w:r>
                           </w:p>
                         </w:txbxContent>
@@ -166,15 +158,7 @@
                         <w:jc w:val="center"/>
                       </w:pPr>
                       <w:r>
-                        <w:t>(</w:t>
-                      </w:r>
-                      <w:proofErr w:type="spellStart"/>
-                      <w:r>
-                        <w:t>infytel</w:t>
-                      </w:r>
-                      <w:proofErr w:type="spellEnd"/>
-                      <w:r>
-                        <w:t>-friend-family)</w:t>
+                        <w:t>(infytel-friend-family)</w:t>
                       </w:r>
                     </w:p>
                   </w:txbxContent>
@@ -472,15 +456,7 @@
                               <w:jc w:val="center"/>
                             </w:pPr>
                             <w:r>
-                              <w:t>(</w:t>
-                            </w:r>
-                            <w:proofErr w:type="spellStart"/>
-                            <w:r>
-                              <w:t>infytel</w:t>
-                            </w:r>
-                            <w:proofErr w:type="spellEnd"/>
-                            <w:r>
-                              <w:t>-customer)</w:t>
+                              <w:t>(infytel-customer)</w:t>
                             </w:r>
                           </w:p>
                         </w:txbxContent>
@@ -518,15 +494,7 @@
                         <w:jc w:val="center"/>
                       </w:pPr>
                       <w:r>
-                        <w:t>(</w:t>
-                      </w:r>
-                      <w:proofErr w:type="spellStart"/>
-                      <w:r>
-                        <w:t>infytel</w:t>
-                      </w:r>
-                      <w:proofErr w:type="spellEnd"/>
-                      <w:r>
-                        <w:t>-customer)</w:t>
+                        <w:t>(infytel-customer)</w:t>
                       </w:r>
                     </w:p>
                   </w:txbxContent>
@@ -611,15 +579,7 @@
                               <w:jc w:val="center"/>
                             </w:pPr>
                             <w:r>
-                              <w:t>(</w:t>
-                            </w:r>
-                            <w:proofErr w:type="spellStart"/>
-                            <w:r>
-                              <w:t>infytel</w:t>
-                            </w:r>
-                            <w:proofErr w:type="spellEnd"/>
-                            <w:r>
-                              <w:t>-friend-family)</w:t>
+                              <w:t>(infytel-friend-family)</w:t>
                             </w:r>
                           </w:p>
                         </w:txbxContent>
@@ -665,15 +625,7 @@
                         <w:jc w:val="center"/>
                       </w:pPr>
                       <w:r>
-                        <w:t>(</w:t>
-                      </w:r>
-                      <w:proofErr w:type="spellStart"/>
-                      <w:r>
-                        <w:t>infytel</w:t>
-                      </w:r>
-                      <w:proofErr w:type="spellEnd"/>
-                      <w:r>
-                        <w:t>-friend-family)</w:t>
+                        <w:t>(infytel-friend-family)</w:t>
                       </w:r>
                     </w:p>
                   </w:txbxContent>
@@ -758,15 +710,7 @@
                               <w:jc w:val="center"/>
                             </w:pPr>
                             <w:r>
-                              <w:t>(</w:t>
-                            </w:r>
-                            <w:proofErr w:type="spellStart"/>
-                            <w:r>
-                              <w:t>infytel</w:t>
-                            </w:r>
-                            <w:proofErr w:type="spellEnd"/>
-                            <w:r>
-                              <w:t>-friend-family)</w:t>
+                              <w:t>(infytel-friend-family)</w:t>
                             </w:r>
                           </w:p>
                         </w:txbxContent>
@@ -812,15 +756,7 @@
                         <w:jc w:val="center"/>
                       </w:pPr>
                       <w:r>
-                        <w:t>(</w:t>
-                      </w:r>
-                      <w:proofErr w:type="spellStart"/>
-                      <w:r>
-                        <w:t>infytel</w:t>
-                      </w:r>
-                      <w:proofErr w:type="spellEnd"/>
-                      <w:r>
-                        <w:t>-friend-family)</w:t>
+                        <w:t>(infytel-friend-family)</w:t>
                       </w:r>
                     </w:p>
                   </w:txbxContent>
@@ -931,23 +867,7 @@
           <w:sz w:val="20"/>
           <w:szCs w:val="20"/>
         </w:rPr>
-        <w:t xml:space="preserve">There is one LB per MS. This LB is a hardware LB which sits </w:t>
-      </w:r>
-      <w:proofErr w:type="spellStart"/>
-      <w:r>
-        <w:rPr>
-          <w:sz w:val="20"/>
-          <w:szCs w:val="20"/>
-        </w:rPr>
-        <w:t>infront</w:t>
-      </w:r>
-      <w:proofErr w:type="spellEnd"/>
-      <w:r>
-        <w:rPr>
-          <w:sz w:val="20"/>
-          <w:szCs w:val="20"/>
-        </w:rPr>
-        <w:t xml:space="preserve"> of the MS and routes the requests </w:t>
+        <w:t xml:space="preserve">There is one LB per MS. This LB is a hardware LB which sits infront of the MS and routes the requests </w:t>
       </w:r>
       <w:r>
         <w:rPr>
@@ -1108,15 +1028,7 @@
         </w:numPr>
       </w:pPr>
       <w:r>
-        <w:t xml:space="preserve">Static Load Balancing – When the list of instances </w:t>
-      </w:r>
-      <w:proofErr w:type="gramStart"/>
-      <w:r>
-        <w:t>are</w:t>
-      </w:r>
-      <w:proofErr w:type="gramEnd"/>
-      <w:r>
-        <w:t xml:space="preserve"> statically provided to the Load Balancer.</w:t>
+        <w:t>Static Load Balancing – When the list of instances are statically provided to the Load Balancer.</w:t>
       </w:r>
     </w:p>
     <w:p>
@@ -1131,15 +1043,7 @@
         <w:t>Dynamic</w:t>
       </w:r>
       <w:r>
-        <w:t xml:space="preserve"> Load Balancing – When the list of instances </w:t>
-      </w:r>
-      <w:proofErr w:type="gramStart"/>
-      <w:r>
-        <w:t>are</w:t>
-      </w:r>
-      <w:proofErr w:type="gramEnd"/>
-      <w:r>
-        <w:t xml:space="preserve"> dynamically discovered by the Load Balancer server by interaction through service discovery.</w:t>
+        <w:t xml:space="preserve"> Load Balancing – When the list of instances are dynamically discovered by the Load Balancer server by interaction through service discovery.</w:t>
       </w:r>
     </w:p>
     <w:p/>
@@ -1177,13 +1081,8 @@
       <w:r>
         <w:br/>
       </w:r>
-      <w:proofErr w:type="gramStart"/>
-      <w:r>
-        <w:t>&lt;!--</w:t>
-      </w:r>
-      <w:proofErr w:type="gramEnd"/>
-      <w:r>
-        <w:t xml:space="preserve"> Dependency for spring cloud Load Balancer --&gt;</w:t>
+      <w:r>
+        <w:t>&lt;!-- Dependency for spring cloud Load Balancer --&gt;</w:t>
       </w:r>
     </w:p>
     <w:p>
@@ -1210,35 +1109,7 @@
       </w:r>
       <w:r>
         <w:tab/>
-      </w:r>
-      <w:proofErr w:type="gramStart"/>
-      <w:r>
-        <w:t>&lt;</w:t>
-      </w:r>
-      <w:proofErr w:type="spellStart"/>
-      <w:r>
-        <w:t>groupId</w:t>
-      </w:r>
-      <w:proofErr w:type="spellEnd"/>
-      <w:r>
-        <w:t>&gt;</w:t>
-      </w:r>
-      <w:proofErr w:type="spellStart"/>
-      <w:r>
-        <w:t>org.springframework.cloud</w:t>
-      </w:r>
-      <w:proofErr w:type="spellEnd"/>
-      <w:proofErr w:type="gramEnd"/>
-      <w:r>
-        <w:t>&lt;/</w:t>
-      </w:r>
-      <w:proofErr w:type="spellStart"/>
-      <w:r>
-        <w:t>groupId</w:t>
-      </w:r>
-      <w:proofErr w:type="spellEnd"/>
-      <w:r>
-        <w:t>&gt;</w:t>
+        <w:t>&lt;groupId&gt;org.springframework.cloud&lt;/groupId&gt;</w:t>
       </w:r>
     </w:p>
     <w:p>
@@ -1253,31 +1124,7 @@
       </w:r>
       <w:r>
         <w:tab/>
-        <w:t>&lt;</w:t>
-      </w:r>
-      <w:proofErr w:type="spellStart"/>
-      <w:r>
-        <w:t>artifactId</w:t>
-      </w:r>
-      <w:proofErr w:type="spellEnd"/>
-      <w:r>
-        <w:t>&gt;spring-cloud-starter-</w:t>
-      </w:r>
-      <w:proofErr w:type="spellStart"/>
-      <w:r>
-        <w:t>loadbalancer</w:t>
-      </w:r>
-      <w:proofErr w:type="spellEnd"/>
-      <w:r>
-        <w:t>&lt;/</w:t>
-      </w:r>
-      <w:proofErr w:type="spellStart"/>
-      <w:r>
-        <w:t>artifactId</w:t>
-      </w:r>
-      <w:proofErr w:type="spellEnd"/>
-      <w:r>
-        <w:t>&gt;</w:t>
+        <w:t>&lt;artifactId&gt;spring-cloud-starter-loadbalancer&lt;/artifactId&gt;</w:t>
       </w:r>
     </w:p>
     <w:p>
@@ -1316,15 +1163,7 @@
         <w:br/>
       </w:r>
       <w:r>
-        <w:t xml:space="preserve">Create a </w:t>
-      </w:r>
-      <w:proofErr w:type="spellStart"/>
-      <w:r>
-        <w:t>JavaBased</w:t>
-      </w:r>
-      <w:proofErr w:type="spellEnd"/>
-      <w:r>
-        <w:t xml:space="preserve"> Configuration for the service.</w:t>
+        <w:t>Create a JavaBased Configuration for the service.</w:t>
       </w:r>
     </w:p>
     <w:p>
@@ -1346,542 +1185,178 @@
           <w:sz w:val="20"/>
           <w:szCs w:val="20"/>
         </w:rPr>
-        <w:t xml:space="preserve">package </w:t>
-      </w:r>
-      <w:proofErr w:type="spellStart"/>
-      <w:proofErr w:type="gramStart"/>
-      <w:r>
-        <w:rPr>
-          <w:sz w:val="20"/>
-          <w:szCs w:val="20"/>
-        </w:rPr>
-        <w:t>com.infosys</w:t>
-      </w:r>
-      <w:proofErr w:type="gramEnd"/>
-      <w:r>
-        <w:rPr>
-          <w:sz w:val="20"/>
-          <w:szCs w:val="20"/>
-        </w:rPr>
-        <w:t>.</w:t>
-      </w:r>
-      <w:proofErr w:type="gramStart"/>
-      <w:r>
-        <w:rPr>
-          <w:sz w:val="20"/>
-          <w:szCs w:val="20"/>
-        </w:rPr>
-        <w:t>infytel.customer</w:t>
-      </w:r>
-      <w:proofErr w:type="spellEnd"/>
-      <w:proofErr w:type="gramEnd"/>
-      <w:r>
-        <w:rPr>
-          <w:sz w:val="20"/>
-          <w:szCs w:val="20"/>
-        </w:rPr>
-        <w:t>;</w:t>
-      </w:r>
-    </w:p>
-    <w:p>
-      <w:pPr>
-        <w:spacing w:after="0"/>
-        <w:rPr>
-          <w:sz w:val="20"/>
-          <w:szCs w:val="20"/>
-        </w:rPr>
-      </w:pPr>
-    </w:p>
-    <w:p>
-      <w:pPr>
-        <w:spacing w:after="0"/>
-        <w:rPr>
-          <w:sz w:val="20"/>
-          <w:szCs w:val="20"/>
-        </w:rPr>
-      </w:pPr>
-      <w:r>
-        <w:rPr>
-          <w:sz w:val="20"/>
-          <w:szCs w:val="20"/>
-        </w:rPr>
-        <w:t xml:space="preserve">import </w:t>
-      </w:r>
-      <w:proofErr w:type="spellStart"/>
-      <w:proofErr w:type="gramStart"/>
-      <w:r>
-        <w:rPr>
-          <w:sz w:val="20"/>
-          <w:szCs w:val="20"/>
-        </w:rPr>
-        <w:t>java.util</w:t>
-      </w:r>
-      <w:proofErr w:type="gramEnd"/>
-      <w:r>
-        <w:rPr>
-          <w:sz w:val="20"/>
-          <w:szCs w:val="20"/>
-        </w:rPr>
-        <w:t>.Arrays</w:t>
-      </w:r>
-      <w:proofErr w:type="spellEnd"/>
-      <w:r>
-        <w:rPr>
-          <w:sz w:val="20"/>
-          <w:szCs w:val="20"/>
-        </w:rPr>
-        <w:t>;</w:t>
-      </w:r>
-    </w:p>
-    <w:p>
-      <w:pPr>
-        <w:spacing w:after="0"/>
-        <w:rPr>
-          <w:sz w:val="20"/>
-          <w:szCs w:val="20"/>
-        </w:rPr>
-      </w:pPr>
-      <w:r>
-        <w:rPr>
-          <w:sz w:val="20"/>
-          <w:szCs w:val="20"/>
-        </w:rPr>
-        <w:t xml:space="preserve">import </w:t>
-      </w:r>
-      <w:proofErr w:type="spellStart"/>
-      <w:proofErr w:type="gramStart"/>
-      <w:r>
-        <w:rPr>
-          <w:sz w:val="20"/>
-          <w:szCs w:val="20"/>
-        </w:rPr>
-        <w:t>java.util</w:t>
-      </w:r>
-      <w:proofErr w:type="gramEnd"/>
-      <w:r>
-        <w:rPr>
-          <w:sz w:val="20"/>
-          <w:szCs w:val="20"/>
-        </w:rPr>
-        <w:t>.List</w:t>
-      </w:r>
-      <w:proofErr w:type="spellEnd"/>
-      <w:r>
-        <w:rPr>
-          <w:sz w:val="20"/>
-          <w:szCs w:val="20"/>
-        </w:rPr>
-        <w:t>;</w:t>
-      </w:r>
-    </w:p>
-    <w:p>
-      <w:pPr>
-        <w:spacing w:after="0"/>
-        <w:rPr>
-          <w:sz w:val="20"/>
-          <w:szCs w:val="20"/>
-        </w:rPr>
-      </w:pPr>
-    </w:p>
-    <w:p>
-      <w:pPr>
-        <w:spacing w:after="0"/>
-        <w:rPr>
-          <w:sz w:val="20"/>
-          <w:szCs w:val="20"/>
-        </w:rPr>
-      </w:pPr>
-      <w:r>
-        <w:rPr>
-          <w:sz w:val="20"/>
-          <w:szCs w:val="20"/>
-        </w:rPr>
-        <w:t xml:space="preserve">import </w:t>
-      </w:r>
-      <w:proofErr w:type="spellStart"/>
-      <w:proofErr w:type="gramStart"/>
-      <w:r>
-        <w:rPr>
-          <w:sz w:val="20"/>
-          <w:szCs w:val="20"/>
-        </w:rPr>
-        <w:t>org.springframework</w:t>
-      </w:r>
-      <w:proofErr w:type="gramEnd"/>
-      <w:r>
-        <w:rPr>
-          <w:sz w:val="20"/>
-          <w:szCs w:val="20"/>
-        </w:rPr>
-        <w:t>.</w:t>
-      </w:r>
-      <w:proofErr w:type="gramStart"/>
-      <w:r>
-        <w:rPr>
-          <w:sz w:val="20"/>
-          <w:szCs w:val="20"/>
-        </w:rPr>
-        <w:t>cloud.client</w:t>
-      </w:r>
-      <w:proofErr w:type="gramEnd"/>
-      <w:r>
-        <w:rPr>
-          <w:sz w:val="20"/>
-          <w:szCs w:val="20"/>
-        </w:rPr>
-        <w:t>.DefaultServiceInstance</w:t>
-      </w:r>
-      <w:proofErr w:type="spellEnd"/>
-      <w:r>
-        <w:rPr>
-          <w:sz w:val="20"/>
-          <w:szCs w:val="20"/>
-        </w:rPr>
-        <w:t>;</w:t>
-      </w:r>
-    </w:p>
-    <w:p>
-      <w:pPr>
-        <w:spacing w:after="0"/>
-        <w:rPr>
-          <w:sz w:val="20"/>
-          <w:szCs w:val="20"/>
-        </w:rPr>
-      </w:pPr>
-      <w:r>
-        <w:rPr>
-          <w:sz w:val="20"/>
-          <w:szCs w:val="20"/>
-        </w:rPr>
-        <w:t xml:space="preserve">import </w:t>
-      </w:r>
-      <w:proofErr w:type="spellStart"/>
-      <w:proofErr w:type="gramStart"/>
-      <w:r>
-        <w:rPr>
-          <w:sz w:val="20"/>
-          <w:szCs w:val="20"/>
-        </w:rPr>
-        <w:t>org.springframework</w:t>
-      </w:r>
-      <w:proofErr w:type="gramEnd"/>
-      <w:r>
-        <w:rPr>
-          <w:sz w:val="20"/>
-          <w:szCs w:val="20"/>
-        </w:rPr>
-        <w:t>.</w:t>
-      </w:r>
-      <w:proofErr w:type="gramStart"/>
-      <w:r>
-        <w:rPr>
-          <w:sz w:val="20"/>
-          <w:szCs w:val="20"/>
-        </w:rPr>
-        <w:t>cloud.client</w:t>
-      </w:r>
-      <w:proofErr w:type="gramEnd"/>
-      <w:r>
-        <w:rPr>
-          <w:sz w:val="20"/>
-          <w:szCs w:val="20"/>
-        </w:rPr>
-        <w:t>.ServiceInstance</w:t>
-      </w:r>
-      <w:proofErr w:type="spellEnd"/>
-      <w:r>
-        <w:rPr>
-          <w:sz w:val="20"/>
-          <w:szCs w:val="20"/>
-        </w:rPr>
-        <w:t>;</w:t>
-      </w:r>
-    </w:p>
-    <w:p>
-      <w:pPr>
-        <w:spacing w:after="0"/>
-        <w:rPr>
-          <w:sz w:val="20"/>
-          <w:szCs w:val="20"/>
-        </w:rPr>
-      </w:pPr>
-      <w:r>
-        <w:rPr>
-          <w:sz w:val="20"/>
-          <w:szCs w:val="20"/>
-        </w:rPr>
-        <w:t xml:space="preserve">import </w:t>
-      </w:r>
-      <w:proofErr w:type="gramStart"/>
-      <w:r>
-        <w:rPr>
-          <w:sz w:val="20"/>
-          <w:szCs w:val="20"/>
-        </w:rPr>
-        <w:t>org.springframework</w:t>
-      </w:r>
-      <w:proofErr w:type="gramEnd"/>
-      <w:r>
-        <w:rPr>
-          <w:sz w:val="20"/>
-          <w:szCs w:val="20"/>
-        </w:rPr>
-        <w:t>.</w:t>
-      </w:r>
-      <w:proofErr w:type="gramStart"/>
-      <w:r>
-        <w:rPr>
-          <w:sz w:val="20"/>
-          <w:szCs w:val="20"/>
-        </w:rPr>
-        <w:t>cloud.loadbalancer</w:t>
-      </w:r>
-      <w:proofErr w:type="gramEnd"/>
-      <w:r>
-        <w:rPr>
-          <w:sz w:val="20"/>
-          <w:szCs w:val="20"/>
-        </w:rPr>
-        <w:t>.</w:t>
-      </w:r>
-      <w:proofErr w:type="gramStart"/>
-      <w:r>
-        <w:rPr>
-          <w:sz w:val="20"/>
-          <w:szCs w:val="20"/>
-        </w:rPr>
-        <w:t>core.ServiceInstanceListSupplier</w:t>
-      </w:r>
-      <w:proofErr w:type="gramEnd"/>
-      <w:r>
-        <w:rPr>
-          <w:sz w:val="20"/>
-          <w:szCs w:val="20"/>
-        </w:rPr>
-        <w:t>;</w:t>
-      </w:r>
-    </w:p>
-    <w:p>
-      <w:pPr>
-        <w:spacing w:after="0"/>
-        <w:rPr>
-          <w:sz w:val="20"/>
-          <w:szCs w:val="20"/>
-        </w:rPr>
-      </w:pPr>
-      <w:r>
-        <w:rPr>
-          <w:sz w:val="20"/>
-          <w:szCs w:val="20"/>
-        </w:rPr>
-        <w:t xml:space="preserve">import </w:t>
-      </w:r>
-      <w:proofErr w:type="spellStart"/>
-      <w:proofErr w:type="gramStart"/>
-      <w:r>
-        <w:rPr>
-          <w:sz w:val="20"/>
-          <w:szCs w:val="20"/>
-        </w:rPr>
-        <w:t>org.springframework</w:t>
-      </w:r>
-      <w:proofErr w:type="gramEnd"/>
-      <w:r>
-        <w:rPr>
-          <w:sz w:val="20"/>
-          <w:szCs w:val="20"/>
-        </w:rPr>
-        <w:t>.</w:t>
-      </w:r>
-      <w:proofErr w:type="gramStart"/>
-      <w:r>
-        <w:rPr>
-          <w:sz w:val="20"/>
-          <w:szCs w:val="20"/>
-        </w:rPr>
-        <w:t>context.annotation</w:t>
-      </w:r>
-      <w:proofErr w:type="gramEnd"/>
-      <w:r>
-        <w:rPr>
-          <w:sz w:val="20"/>
-          <w:szCs w:val="20"/>
-        </w:rPr>
-        <w:t>.Bean</w:t>
-      </w:r>
-      <w:proofErr w:type="spellEnd"/>
-      <w:r>
-        <w:rPr>
-          <w:sz w:val="20"/>
-          <w:szCs w:val="20"/>
-        </w:rPr>
-        <w:t>;</w:t>
-      </w:r>
-    </w:p>
-    <w:p>
-      <w:pPr>
-        <w:spacing w:after="0"/>
-        <w:rPr>
-          <w:sz w:val="20"/>
-          <w:szCs w:val="20"/>
-        </w:rPr>
-      </w:pPr>
-      <w:r>
-        <w:rPr>
-          <w:sz w:val="20"/>
-          <w:szCs w:val="20"/>
-        </w:rPr>
-        <w:t xml:space="preserve">import </w:t>
-      </w:r>
-      <w:proofErr w:type="spellStart"/>
-      <w:proofErr w:type="gramStart"/>
-      <w:r>
-        <w:rPr>
-          <w:sz w:val="20"/>
-          <w:szCs w:val="20"/>
-        </w:rPr>
-        <w:t>org.springframework</w:t>
-      </w:r>
-      <w:proofErr w:type="gramEnd"/>
-      <w:r>
-        <w:rPr>
-          <w:sz w:val="20"/>
-          <w:szCs w:val="20"/>
-        </w:rPr>
-        <w:t>.</w:t>
-      </w:r>
-      <w:proofErr w:type="gramStart"/>
-      <w:r>
-        <w:rPr>
-          <w:sz w:val="20"/>
-          <w:szCs w:val="20"/>
-        </w:rPr>
-        <w:t>context.annotation</w:t>
-      </w:r>
-      <w:proofErr w:type="gramEnd"/>
-      <w:r>
-        <w:rPr>
-          <w:sz w:val="20"/>
-          <w:szCs w:val="20"/>
-        </w:rPr>
-        <w:t>.Primary</w:t>
-      </w:r>
-      <w:proofErr w:type="spellEnd"/>
-      <w:r>
-        <w:rPr>
-          <w:sz w:val="20"/>
-          <w:szCs w:val="20"/>
-        </w:rPr>
-        <w:t>;</w:t>
-      </w:r>
-    </w:p>
-    <w:p>
-      <w:pPr>
-        <w:spacing w:after="0"/>
-        <w:rPr>
-          <w:sz w:val="20"/>
-          <w:szCs w:val="20"/>
-        </w:rPr>
-      </w:pPr>
-      <w:r>
-        <w:rPr>
-          <w:sz w:val="20"/>
-          <w:szCs w:val="20"/>
-        </w:rPr>
-        <w:t xml:space="preserve">import </w:t>
-      </w:r>
-      <w:proofErr w:type="spellStart"/>
-      <w:proofErr w:type="gramStart"/>
-      <w:r>
-        <w:rPr>
-          <w:sz w:val="20"/>
-          <w:szCs w:val="20"/>
-        </w:rPr>
-        <w:t>org.springframework</w:t>
-      </w:r>
-      <w:proofErr w:type="gramEnd"/>
-      <w:r>
-        <w:rPr>
-          <w:sz w:val="20"/>
-          <w:szCs w:val="20"/>
-        </w:rPr>
-        <w:t>.</w:t>
-      </w:r>
-      <w:proofErr w:type="gramStart"/>
-      <w:r>
-        <w:rPr>
-          <w:sz w:val="20"/>
-          <w:szCs w:val="20"/>
-        </w:rPr>
-        <w:t>stereotype.Component</w:t>
-      </w:r>
-      <w:proofErr w:type="spellEnd"/>
-      <w:proofErr w:type="gramEnd"/>
-      <w:r>
-        <w:rPr>
-          <w:sz w:val="20"/>
-          <w:szCs w:val="20"/>
-        </w:rPr>
-        <w:t>;</w:t>
-      </w:r>
-    </w:p>
-    <w:p>
-      <w:pPr>
-        <w:spacing w:after="0"/>
-        <w:rPr>
-          <w:sz w:val="20"/>
-          <w:szCs w:val="20"/>
-        </w:rPr>
-      </w:pPr>
-    </w:p>
-    <w:p>
-      <w:pPr>
-        <w:spacing w:after="0"/>
-        <w:rPr>
-          <w:sz w:val="20"/>
-          <w:szCs w:val="20"/>
-        </w:rPr>
-      </w:pPr>
-      <w:r>
-        <w:rPr>
-          <w:sz w:val="20"/>
-          <w:szCs w:val="20"/>
-        </w:rPr>
-        <w:t xml:space="preserve">import </w:t>
-      </w:r>
-      <w:proofErr w:type="spellStart"/>
-      <w:proofErr w:type="gramStart"/>
-      <w:r>
-        <w:rPr>
-          <w:sz w:val="20"/>
-          <w:szCs w:val="20"/>
-        </w:rPr>
-        <w:t>reactor.core</w:t>
-      </w:r>
-      <w:proofErr w:type="gramEnd"/>
-      <w:r>
-        <w:rPr>
-          <w:sz w:val="20"/>
-          <w:szCs w:val="20"/>
-        </w:rPr>
-        <w:t>.</w:t>
-      </w:r>
-      <w:proofErr w:type="gramStart"/>
-      <w:r>
-        <w:rPr>
-          <w:sz w:val="20"/>
-          <w:szCs w:val="20"/>
-        </w:rPr>
-        <w:t>publisher.Flux</w:t>
-      </w:r>
-      <w:proofErr w:type="spellEnd"/>
-      <w:proofErr w:type="gramEnd"/>
-      <w:r>
-        <w:rPr>
-          <w:sz w:val="20"/>
-          <w:szCs w:val="20"/>
-        </w:rPr>
-        <w:t>;</w:t>
+        <w:t>package com.infosys.infytel.customer;</w:t>
+      </w:r>
+    </w:p>
+    <w:p>
+      <w:pPr>
+        <w:spacing w:after="0"/>
+        <w:rPr>
+          <w:sz w:val="20"/>
+          <w:szCs w:val="20"/>
+        </w:rPr>
+      </w:pPr>
+    </w:p>
+    <w:p>
+      <w:pPr>
+        <w:spacing w:after="0"/>
+        <w:rPr>
+          <w:sz w:val="20"/>
+          <w:szCs w:val="20"/>
+        </w:rPr>
+      </w:pPr>
+      <w:r>
+        <w:rPr>
+          <w:sz w:val="20"/>
+          <w:szCs w:val="20"/>
+        </w:rPr>
+        <w:t>import java.util.Arrays;</w:t>
+      </w:r>
+    </w:p>
+    <w:p>
+      <w:pPr>
+        <w:spacing w:after="0"/>
+        <w:rPr>
+          <w:sz w:val="20"/>
+          <w:szCs w:val="20"/>
+        </w:rPr>
+      </w:pPr>
+      <w:r>
+        <w:rPr>
+          <w:sz w:val="20"/>
+          <w:szCs w:val="20"/>
+        </w:rPr>
+        <w:t>import java.util.List;</w:t>
+      </w:r>
+    </w:p>
+    <w:p>
+      <w:pPr>
+        <w:spacing w:after="0"/>
+        <w:rPr>
+          <w:sz w:val="20"/>
+          <w:szCs w:val="20"/>
+        </w:rPr>
+      </w:pPr>
+    </w:p>
+    <w:p>
+      <w:pPr>
+        <w:spacing w:after="0"/>
+        <w:rPr>
+          <w:sz w:val="20"/>
+          <w:szCs w:val="20"/>
+        </w:rPr>
+      </w:pPr>
+      <w:r>
+        <w:rPr>
+          <w:sz w:val="20"/>
+          <w:szCs w:val="20"/>
+        </w:rPr>
+        <w:t>import org.springframework.cloud.client.DefaultServiceInstance;</w:t>
+      </w:r>
+    </w:p>
+    <w:p>
+      <w:pPr>
+        <w:spacing w:after="0"/>
+        <w:rPr>
+          <w:sz w:val="20"/>
+          <w:szCs w:val="20"/>
+        </w:rPr>
+      </w:pPr>
+      <w:r>
+        <w:rPr>
+          <w:sz w:val="20"/>
+          <w:szCs w:val="20"/>
+        </w:rPr>
+        <w:t>import org.springframework.cloud.client.ServiceInstance;</w:t>
+      </w:r>
+    </w:p>
+    <w:p>
+      <w:pPr>
+        <w:spacing w:after="0"/>
+        <w:rPr>
+          <w:sz w:val="20"/>
+          <w:szCs w:val="20"/>
+        </w:rPr>
+      </w:pPr>
+      <w:r>
+        <w:rPr>
+          <w:sz w:val="20"/>
+          <w:szCs w:val="20"/>
+        </w:rPr>
+        <w:t>import org.springframework.cloud.loadbalancer.core.ServiceInstanceListSupplier;</w:t>
+      </w:r>
+    </w:p>
+    <w:p>
+      <w:pPr>
+        <w:spacing w:after="0"/>
+        <w:rPr>
+          <w:sz w:val="20"/>
+          <w:szCs w:val="20"/>
+        </w:rPr>
+      </w:pPr>
+      <w:r>
+        <w:rPr>
+          <w:sz w:val="20"/>
+          <w:szCs w:val="20"/>
+        </w:rPr>
+        <w:t>import org.springframework.context.annotation.Bean;</w:t>
+      </w:r>
+    </w:p>
+    <w:p>
+      <w:pPr>
+        <w:spacing w:after="0"/>
+        <w:rPr>
+          <w:sz w:val="20"/>
+          <w:szCs w:val="20"/>
+        </w:rPr>
+      </w:pPr>
+      <w:r>
+        <w:rPr>
+          <w:sz w:val="20"/>
+          <w:szCs w:val="20"/>
+        </w:rPr>
+        <w:t>import org.springframework.context.annotation.Primary;</w:t>
+      </w:r>
+    </w:p>
+    <w:p>
+      <w:pPr>
+        <w:spacing w:after="0"/>
+        <w:rPr>
+          <w:sz w:val="20"/>
+          <w:szCs w:val="20"/>
+        </w:rPr>
+      </w:pPr>
+      <w:r>
+        <w:rPr>
+          <w:sz w:val="20"/>
+          <w:szCs w:val="20"/>
+        </w:rPr>
+        <w:t>import org.springframework.stereotype.Component;</w:t>
+      </w:r>
+    </w:p>
+    <w:p>
+      <w:pPr>
+        <w:spacing w:after="0"/>
+        <w:rPr>
+          <w:sz w:val="20"/>
+          <w:szCs w:val="20"/>
+        </w:rPr>
+      </w:pPr>
+    </w:p>
+    <w:p>
+      <w:pPr>
+        <w:spacing w:after="0"/>
+        <w:rPr>
+          <w:sz w:val="20"/>
+          <w:szCs w:val="20"/>
+        </w:rPr>
+      </w:pPr>
+      <w:r>
+        <w:rPr>
+          <w:sz w:val="20"/>
+          <w:szCs w:val="20"/>
+        </w:rPr>
+        <w:t>import reactor.core.publisher.Flux;</w:t>
       </w:r>
     </w:p>
     <w:p>
@@ -1922,23 +1397,7 @@
           <w:sz w:val="20"/>
           <w:szCs w:val="20"/>
         </w:rPr>
-        <w:t xml:space="preserve">public class </w:t>
-      </w:r>
-      <w:proofErr w:type="spellStart"/>
-      <w:r>
-        <w:rPr>
-          <w:sz w:val="20"/>
-          <w:szCs w:val="20"/>
-        </w:rPr>
-        <w:t>LoadBalancerConfig</w:t>
-      </w:r>
-      <w:proofErr w:type="spellEnd"/>
-      <w:r>
-        <w:rPr>
-          <w:sz w:val="20"/>
-          <w:szCs w:val="20"/>
-        </w:rPr>
-        <w:t xml:space="preserve"> {</w:t>
+        <w:t>public class LoadBalancerConfig {</w:t>
       </w:r>
     </w:p>
     <w:p>
@@ -1998,113 +1457,32 @@
           <w:szCs w:val="20"/>
         </w:rPr>
         <w:tab/>
-      </w:r>
-      <w:proofErr w:type="spellStart"/>
-      <w:r>
-        <w:rPr>
-          <w:sz w:val="20"/>
-          <w:szCs w:val="20"/>
-        </w:rPr>
-        <w:t>ServiceInstanceListSupplier</w:t>
-      </w:r>
-      <w:proofErr w:type="spellEnd"/>
-      <w:r>
-        <w:rPr>
-          <w:sz w:val="20"/>
-          <w:szCs w:val="20"/>
-        </w:rPr>
-        <w:t xml:space="preserve"> </w:t>
-      </w:r>
-      <w:proofErr w:type="spellStart"/>
-      <w:proofErr w:type="gramStart"/>
-      <w:r>
-        <w:rPr>
-          <w:sz w:val="20"/>
-          <w:szCs w:val="20"/>
-        </w:rPr>
-        <w:t>serviceInstanceListSupplier</w:t>
-      </w:r>
-      <w:proofErr w:type="spellEnd"/>
-      <w:r>
-        <w:rPr>
-          <w:sz w:val="20"/>
-          <w:szCs w:val="20"/>
-        </w:rPr>
-        <w:t>(</w:t>
-      </w:r>
-      <w:proofErr w:type="gramEnd"/>
-      <w:r>
-        <w:rPr>
-          <w:sz w:val="20"/>
-          <w:szCs w:val="20"/>
-        </w:rPr>
-        <w:t>) {</w:t>
-      </w:r>
-    </w:p>
-    <w:p>
-      <w:pPr>
-        <w:spacing w:after="0"/>
-        <w:rPr>
-          <w:sz w:val="20"/>
-          <w:szCs w:val="20"/>
-        </w:rPr>
-      </w:pPr>
-      <w:r>
-        <w:rPr>
-          <w:sz w:val="20"/>
-          <w:szCs w:val="20"/>
-        </w:rPr>
-        <w:tab/>
-      </w:r>
-      <w:r>
-        <w:rPr>
-          <w:sz w:val="20"/>
-          <w:szCs w:val="20"/>
-        </w:rPr>
-        <w:tab/>
-        <w:t xml:space="preserve">return new </w:t>
-      </w:r>
-      <w:proofErr w:type="spellStart"/>
-      <w:r>
-        <w:rPr>
-          <w:sz w:val="20"/>
-          <w:szCs w:val="20"/>
-        </w:rPr>
-        <w:t>DemoServiceInstanceListSupplier</w:t>
-      </w:r>
-      <w:proofErr w:type="spellEnd"/>
-      <w:r>
-        <w:rPr>
-          <w:sz w:val="20"/>
-          <w:szCs w:val="20"/>
-        </w:rPr>
-        <w:t>("</w:t>
-      </w:r>
-      <w:proofErr w:type="spellStart"/>
-      <w:r>
-        <w:rPr>
-          <w:sz w:val="20"/>
-          <w:szCs w:val="20"/>
-        </w:rPr>
-        <w:t>infytel</w:t>
-      </w:r>
-      <w:proofErr w:type="spellEnd"/>
-      <w:r>
-        <w:rPr>
-          <w:sz w:val="20"/>
-          <w:szCs w:val="20"/>
-        </w:rPr>
-        <w:t>-friend-family"</w:t>
-      </w:r>
-      <w:proofErr w:type="gramStart"/>
-      <w:r>
-        <w:rPr>
-          <w:sz w:val="20"/>
-          <w:szCs w:val="20"/>
-        </w:rPr>
-        <w:t>) ;</w:t>
-      </w:r>
-      <w:proofErr w:type="gramEnd"/>
+        <w:t>ServiceInstanceListSupplier serviceInstanceListSupplier() {</w:t>
+      </w:r>
+    </w:p>
+    <w:p>
+      <w:pPr>
+        <w:spacing w:after="0"/>
+        <w:rPr>
+          <w:sz w:val="20"/>
+          <w:szCs w:val="20"/>
+        </w:rPr>
+      </w:pPr>
+      <w:r>
+        <w:rPr>
+          <w:sz w:val="20"/>
+          <w:szCs w:val="20"/>
+        </w:rPr>
+        <w:tab/>
+      </w:r>
+      <w:r>
+        <w:rPr>
+          <w:sz w:val="20"/>
+          <w:szCs w:val="20"/>
+        </w:rPr>
+        <w:tab/>
+        <w:t>return new DemoServiceInstanceListSupplier("infytel-friend-family") ;</w:t>
+      </w:r>
     </w:p>
     <w:p>
       <w:pPr>
@@ -2185,259 +1563,132 @@
           <w:szCs w:val="20"/>
         </w:rPr>
         <w:tab/>
-        <w:t xml:space="preserve">class </w:t>
-      </w:r>
-      <w:proofErr w:type="spellStart"/>
-      <w:r>
-        <w:rPr>
-          <w:sz w:val="20"/>
-          <w:szCs w:val="20"/>
-        </w:rPr>
-        <w:t>DemoServiceInstanceListSupplier</w:t>
-      </w:r>
-      <w:proofErr w:type="spellEnd"/>
-      <w:r>
-        <w:rPr>
-          <w:sz w:val="20"/>
-          <w:szCs w:val="20"/>
-        </w:rPr>
-        <w:t xml:space="preserve"> implements </w:t>
-      </w:r>
-      <w:proofErr w:type="spellStart"/>
-      <w:proofErr w:type="gramStart"/>
-      <w:r>
-        <w:rPr>
-          <w:sz w:val="20"/>
-          <w:szCs w:val="20"/>
-        </w:rPr>
-        <w:t>ServiceInstanceListSupplier</w:t>
-      </w:r>
-      <w:proofErr w:type="spellEnd"/>
-      <w:r>
-        <w:rPr>
-          <w:sz w:val="20"/>
-          <w:szCs w:val="20"/>
-        </w:rPr>
-        <w:t>{</w:t>
-      </w:r>
-      <w:proofErr w:type="gramEnd"/>
-    </w:p>
-    <w:p>
-      <w:pPr>
-        <w:spacing w:after="0"/>
-        <w:rPr>
-          <w:sz w:val="20"/>
-          <w:szCs w:val="20"/>
-        </w:rPr>
-      </w:pPr>
-      <w:r>
-        <w:rPr>
-          <w:sz w:val="20"/>
-          <w:szCs w:val="20"/>
-        </w:rPr>
-        <w:tab/>
-      </w:r>
-      <w:r>
-        <w:rPr>
-          <w:sz w:val="20"/>
-          <w:szCs w:val="20"/>
-        </w:rPr>
-        <w:tab/>
-      </w:r>
-    </w:p>
-    <w:p>
-      <w:pPr>
-        <w:spacing w:after="0"/>
-        <w:rPr>
-          <w:sz w:val="20"/>
-          <w:szCs w:val="20"/>
-        </w:rPr>
-      </w:pPr>
-      <w:r>
-        <w:rPr>
-          <w:sz w:val="20"/>
-          <w:szCs w:val="20"/>
-        </w:rPr>
-        <w:tab/>
-      </w:r>
-      <w:r>
-        <w:rPr>
-          <w:sz w:val="20"/>
-          <w:szCs w:val="20"/>
-        </w:rPr>
-        <w:tab/>
-        <w:t xml:space="preserve">private final String </w:t>
-      </w:r>
-      <w:proofErr w:type="spellStart"/>
-      <w:proofErr w:type="gramStart"/>
-      <w:r>
-        <w:rPr>
-          <w:sz w:val="20"/>
-          <w:szCs w:val="20"/>
-        </w:rPr>
-        <w:t>serviceId</w:t>
-      </w:r>
-      <w:proofErr w:type="spellEnd"/>
-      <w:r>
-        <w:rPr>
-          <w:sz w:val="20"/>
-          <w:szCs w:val="20"/>
-        </w:rPr>
-        <w:t xml:space="preserve"> ;</w:t>
-      </w:r>
-      <w:proofErr w:type="gramEnd"/>
-    </w:p>
-    <w:p>
-      <w:pPr>
-        <w:spacing w:after="0"/>
-        <w:rPr>
-          <w:sz w:val="20"/>
-          <w:szCs w:val="20"/>
-        </w:rPr>
-      </w:pPr>
-      <w:r>
-        <w:rPr>
-          <w:sz w:val="20"/>
-          <w:szCs w:val="20"/>
-        </w:rPr>
-        <w:tab/>
-      </w:r>
-      <w:r>
-        <w:rPr>
-          <w:sz w:val="20"/>
-          <w:szCs w:val="20"/>
-        </w:rPr>
-        <w:tab/>
-      </w:r>
-    </w:p>
-    <w:p>
-      <w:pPr>
-        <w:spacing w:after="0"/>
-        <w:rPr>
-          <w:sz w:val="20"/>
-          <w:szCs w:val="20"/>
-        </w:rPr>
-      </w:pPr>
-      <w:r>
-        <w:rPr>
-          <w:sz w:val="20"/>
-          <w:szCs w:val="20"/>
-        </w:rPr>
-        <w:tab/>
-      </w:r>
-      <w:r>
-        <w:rPr>
-          <w:sz w:val="20"/>
-          <w:szCs w:val="20"/>
-        </w:rPr>
-        <w:tab/>
-      </w:r>
-      <w:proofErr w:type="spellStart"/>
-      <w:proofErr w:type="gramStart"/>
-      <w:r>
-        <w:rPr>
-          <w:sz w:val="20"/>
-          <w:szCs w:val="20"/>
-        </w:rPr>
-        <w:t>DemoServiceInstanceListSupplier</w:t>
-      </w:r>
-      <w:proofErr w:type="spellEnd"/>
-      <w:r>
-        <w:rPr>
-          <w:sz w:val="20"/>
-          <w:szCs w:val="20"/>
-        </w:rPr>
-        <w:t>(</w:t>
-      </w:r>
-      <w:proofErr w:type="gramEnd"/>
-      <w:r>
-        <w:rPr>
-          <w:sz w:val="20"/>
-          <w:szCs w:val="20"/>
-        </w:rPr>
-        <w:t xml:space="preserve">String </w:t>
-      </w:r>
-      <w:proofErr w:type="spellStart"/>
-      <w:proofErr w:type="gramStart"/>
-      <w:r>
-        <w:rPr>
-          <w:sz w:val="20"/>
-          <w:szCs w:val="20"/>
-        </w:rPr>
-        <w:t>serviceId</w:t>
-      </w:r>
-      <w:proofErr w:type="spellEnd"/>
-      <w:r>
-        <w:rPr>
-          <w:sz w:val="20"/>
-          <w:szCs w:val="20"/>
-        </w:rPr>
-        <w:t>){</w:t>
-      </w:r>
-      <w:proofErr w:type="gramEnd"/>
-    </w:p>
-    <w:p>
-      <w:pPr>
-        <w:spacing w:after="0"/>
-        <w:rPr>
-          <w:sz w:val="20"/>
-          <w:szCs w:val="20"/>
-        </w:rPr>
-      </w:pPr>
-      <w:r>
-        <w:rPr>
-          <w:sz w:val="20"/>
-          <w:szCs w:val="20"/>
-        </w:rPr>
-        <w:tab/>
-      </w:r>
-      <w:r>
-        <w:rPr>
-          <w:sz w:val="20"/>
-          <w:szCs w:val="20"/>
-        </w:rPr>
-        <w:tab/>
-      </w:r>
-      <w:r>
-        <w:rPr>
-          <w:sz w:val="20"/>
-          <w:szCs w:val="20"/>
-        </w:rPr>
-        <w:tab/>
-      </w:r>
-      <w:proofErr w:type="spellStart"/>
-      <w:proofErr w:type="gramStart"/>
-      <w:r>
-        <w:rPr>
-          <w:sz w:val="20"/>
-          <w:szCs w:val="20"/>
-        </w:rPr>
-        <w:t>this.serviceId</w:t>
-      </w:r>
-      <w:proofErr w:type="spellEnd"/>
-      <w:proofErr w:type="gramEnd"/>
-      <w:r>
-        <w:rPr>
-          <w:sz w:val="20"/>
-          <w:szCs w:val="20"/>
-        </w:rPr>
-        <w:t>=</w:t>
-      </w:r>
-      <w:proofErr w:type="spellStart"/>
-      <w:r>
-        <w:rPr>
-          <w:sz w:val="20"/>
-          <w:szCs w:val="20"/>
-        </w:rPr>
-        <w:t>serviceId</w:t>
-      </w:r>
-      <w:proofErr w:type="spellEnd"/>
-      <w:r>
-        <w:rPr>
-          <w:sz w:val="20"/>
-          <w:szCs w:val="20"/>
-        </w:rPr>
-        <w:t>;</w:t>
+        <w:t>class DemoServiceInstanceListSupplier implements ServiceInstanceListSupplier{</w:t>
+      </w:r>
+    </w:p>
+    <w:p>
+      <w:pPr>
+        <w:spacing w:after="0"/>
+        <w:rPr>
+          <w:sz w:val="20"/>
+          <w:szCs w:val="20"/>
+        </w:rPr>
+      </w:pPr>
+      <w:r>
+        <w:rPr>
+          <w:sz w:val="20"/>
+          <w:szCs w:val="20"/>
+        </w:rPr>
+        <w:tab/>
+      </w:r>
+      <w:r>
+        <w:rPr>
+          <w:sz w:val="20"/>
+          <w:szCs w:val="20"/>
+        </w:rPr>
+        <w:tab/>
+      </w:r>
+    </w:p>
+    <w:p>
+      <w:pPr>
+        <w:spacing w:after="0"/>
+        <w:rPr>
+          <w:sz w:val="20"/>
+          <w:szCs w:val="20"/>
+        </w:rPr>
+      </w:pPr>
+      <w:r>
+        <w:rPr>
+          <w:sz w:val="20"/>
+          <w:szCs w:val="20"/>
+        </w:rPr>
+        <w:tab/>
+      </w:r>
+      <w:r>
+        <w:rPr>
+          <w:sz w:val="20"/>
+          <w:szCs w:val="20"/>
+        </w:rPr>
+        <w:tab/>
+        <w:t>private final String serviceId ;</w:t>
+      </w:r>
+    </w:p>
+    <w:p>
+      <w:pPr>
+        <w:spacing w:after="0"/>
+        <w:rPr>
+          <w:sz w:val="20"/>
+          <w:szCs w:val="20"/>
+        </w:rPr>
+      </w:pPr>
+      <w:r>
+        <w:rPr>
+          <w:sz w:val="20"/>
+          <w:szCs w:val="20"/>
+        </w:rPr>
+        <w:tab/>
+      </w:r>
+      <w:r>
+        <w:rPr>
+          <w:sz w:val="20"/>
+          <w:szCs w:val="20"/>
+        </w:rPr>
+        <w:tab/>
+      </w:r>
+    </w:p>
+    <w:p>
+      <w:pPr>
+        <w:spacing w:after="0"/>
+        <w:rPr>
+          <w:sz w:val="20"/>
+          <w:szCs w:val="20"/>
+        </w:rPr>
+      </w:pPr>
+      <w:r>
+        <w:rPr>
+          <w:sz w:val="20"/>
+          <w:szCs w:val="20"/>
+        </w:rPr>
+        <w:tab/>
+      </w:r>
+      <w:r>
+        <w:rPr>
+          <w:sz w:val="20"/>
+          <w:szCs w:val="20"/>
+        </w:rPr>
+        <w:tab/>
+        <w:t>DemoServiceInstanceListSupplier(String serviceId){</w:t>
+      </w:r>
+    </w:p>
+    <w:p>
+      <w:pPr>
+        <w:spacing w:after="0"/>
+        <w:rPr>
+          <w:sz w:val="20"/>
+          <w:szCs w:val="20"/>
+        </w:rPr>
+      </w:pPr>
+      <w:r>
+        <w:rPr>
+          <w:sz w:val="20"/>
+          <w:szCs w:val="20"/>
+        </w:rPr>
+        <w:tab/>
+      </w:r>
+      <w:r>
+        <w:rPr>
+          <w:sz w:val="20"/>
+          <w:szCs w:val="20"/>
+        </w:rPr>
+        <w:tab/>
+      </w:r>
+      <w:r>
+        <w:rPr>
+          <w:sz w:val="20"/>
+          <w:szCs w:val="20"/>
+        </w:rPr>
+        <w:tab/>
+        <w:t>this.serviceId=serviceId;</w:t>
       </w:r>
     </w:p>
     <w:p>
@@ -2532,205 +1783,83 @@
           <w:szCs w:val="20"/>
         </w:rPr>
         <w:tab/>
-        <w:t>public Flux&lt;List&lt;</w:t>
-      </w:r>
-      <w:proofErr w:type="spellStart"/>
-      <w:r>
-        <w:rPr>
-          <w:sz w:val="20"/>
-          <w:szCs w:val="20"/>
-        </w:rPr>
-        <w:t>ServiceInstance</w:t>
-      </w:r>
-      <w:proofErr w:type="spellEnd"/>
-      <w:r>
-        <w:rPr>
-          <w:sz w:val="20"/>
-          <w:szCs w:val="20"/>
-        </w:rPr>
-        <w:t xml:space="preserve">&gt;&gt; </w:t>
-      </w:r>
-      <w:proofErr w:type="gramStart"/>
-      <w:r>
-        <w:rPr>
-          <w:sz w:val="20"/>
-          <w:szCs w:val="20"/>
-        </w:rPr>
-        <w:t>get(){</w:t>
-      </w:r>
-      <w:proofErr w:type="gramEnd"/>
-    </w:p>
-    <w:p>
-      <w:pPr>
-        <w:spacing w:after="0"/>
-        <w:rPr>
-          <w:sz w:val="20"/>
-          <w:szCs w:val="20"/>
-        </w:rPr>
-      </w:pPr>
-      <w:r>
-        <w:rPr>
-          <w:sz w:val="20"/>
-          <w:szCs w:val="20"/>
-        </w:rPr>
-        <w:tab/>
-      </w:r>
-      <w:r>
-        <w:rPr>
-          <w:sz w:val="20"/>
-          <w:szCs w:val="20"/>
-        </w:rPr>
-        <w:tab/>
-      </w:r>
-      <w:r>
-        <w:rPr>
-          <w:sz w:val="20"/>
-          <w:szCs w:val="20"/>
-        </w:rPr>
-        <w:tab/>
-        <w:t xml:space="preserve">return </w:t>
-      </w:r>
-      <w:proofErr w:type="spellStart"/>
-      <w:r>
-        <w:rPr>
-          <w:sz w:val="20"/>
-          <w:szCs w:val="20"/>
-        </w:rPr>
-        <w:t>Flux.just</w:t>
-      </w:r>
-      <w:proofErr w:type="spellEnd"/>
-      <w:r>
-        <w:rPr>
-          <w:sz w:val="20"/>
-          <w:szCs w:val="20"/>
-        </w:rPr>
-        <w:t>(</w:t>
-      </w:r>
-      <w:proofErr w:type="spellStart"/>
-      <w:r>
-        <w:rPr>
-          <w:sz w:val="20"/>
-          <w:szCs w:val="20"/>
-        </w:rPr>
-        <w:t>Arrays.asList</w:t>
-      </w:r>
-      <w:proofErr w:type="spellEnd"/>
-      <w:r>
-        <w:rPr>
-          <w:sz w:val="20"/>
-          <w:szCs w:val="20"/>
-        </w:rPr>
-        <w:t xml:space="preserve">(new </w:t>
-      </w:r>
-      <w:proofErr w:type="spellStart"/>
-      <w:proofErr w:type="gramStart"/>
-      <w:r>
-        <w:rPr>
-          <w:sz w:val="20"/>
-          <w:szCs w:val="20"/>
-        </w:rPr>
-        <w:t>DefaultServiceInstance</w:t>
-      </w:r>
-      <w:proofErr w:type="spellEnd"/>
-      <w:r>
-        <w:rPr>
-          <w:sz w:val="20"/>
-          <w:szCs w:val="20"/>
-        </w:rPr>
-        <w:t>(</w:t>
-      </w:r>
-      <w:proofErr w:type="spellStart"/>
-      <w:proofErr w:type="gramEnd"/>
-      <w:r>
-        <w:rPr>
-          <w:sz w:val="20"/>
-          <w:szCs w:val="20"/>
-        </w:rPr>
-        <w:t>serviceId</w:t>
-      </w:r>
-      <w:proofErr w:type="spellEnd"/>
-      <w:r>
-        <w:rPr>
-          <w:sz w:val="20"/>
-          <w:szCs w:val="20"/>
-        </w:rPr>
-        <w:t xml:space="preserve">+ "1", </w:t>
-      </w:r>
-      <w:proofErr w:type="spellStart"/>
-      <w:r>
-        <w:rPr>
-          <w:sz w:val="20"/>
-          <w:szCs w:val="20"/>
-        </w:rPr>
-        <w:t>serviceId</w:t>
-      </w:r>
-      <w:proofErr w:type="spellEnd"/>
-      <w:r>
-        <w:rPr>
-          <w:sz w:val="20"/>
-          <w:szCs w:val="20"/>
-        </w:rPr>
-        <w:t>,"localhost",</w:t>
-      </w:r>
-    </w:p>
-    <w:p>
-      <w:pPr>
-        <w:spacing w:after="0"/>
-        <w:rPr>
-          <w:sz w:val="20"/>
-          <w:szCs w:val="20"/>
-        </w:rPr>
-      </w:pPr>
-      <w:r>
-        <w:rPr>
-          <w:sz w:val="20"/>
-          <w:szCs w:val="20"/>
-        </w:rPr>
-        <w:tab/>
-      </w:r>
-      <w:r>
-        <w:rPr>
-          <w:sz w:val="20"/>
-          <w:szCs w:val="20"/>
-        </w:rPr>
-        <w:tab/>
-      </w:r>
-      <w:r>
-        <w:rPr>
-          <w:sz w:val="20"/>
-          <w:szCs w:val="20"/>
-        </w:rPr>
-        <w:tab/>
-      </w:r>
-      <w:r>
-        <w:rPr>
-          <w:sz w:val="20"/>
-          <w:szCs w:val="20"/>
-        </w:rPr>
-        <w:tab/>
-      </w:r>
-      <w:r>
-        <w:rPr>
-          <w:sz w:val="20"/>
-          <w:szCs w:val="20"/>
-        </w:rPr>
-        <w:tab/>
-      </w:r>
-      <w:proofErr w:type="gramStart"/>
-      <w:r>
-        <w:rPr>
-          <w:sz w:val="20"/>
-          <w:szCs w:val="20"/>
-        </w:rPr>
-        <w:t>8081,false</w:t>
-      </w:r>
-      <w:proofErr w:type="gramEnd"/>
-      <w:r>
-        <w:rPr>
-          <w:sz w:val="20"/>
-          <w:szCs w:val="20"/>
-        </w:rPr>
-        <w:t>),</w:t>
+        <w:t>public Flux&lt;List&lt;ServiceInstance&gt;&gt; get(){</w:t>
+      </w:r>
+    </w:p>
+    <w:p>
+      <w:pPr>
+        <w:spacing w:after="0"/>
+        <w:rPr>
+          <w:sz w:val="20"/>
+          <w:szCs w:val="20"/>
+        </w:rPr>
+      </w:pPr>
+      <w:r>
+        <w:rPr>
+          <w:sz w:val="20"/>
+          <w:szCs w:val="20"/>
+        </w:rPr>
+        <w:tab/>
+      </w:r>
+      <w:r>
+        <w:rPr>
+          <w:sz w:val="20"/>
+          <w:szCs w:val="20"/>
+        </w:rPr>
+        <w:tab/>
+      </w:r>
+      <w:r>
+        <w:rPr>
+          <w:sz w:val="20"/>
+          <w:szCs w:val="20"/>
+        </w:rPr>
+        <w:tab/>
+        <w:t>return Flux.just(Arrays.asList(new DefaultServiceInstance(serviceId+ "1", serviceId,"localhost",</w:t>
+      </w:r>
+    </w:p>
+    <w:p>
+      <w:pPr>
+        <w:spacing w:after="0"/>
+        <w:rPr>
+          <w:sz w:val="20"/>
+          <w:szCs w:val="20"/>
+        </w:rPr>
+      </w:pPr>
+      <w:r>
+        <w:rPr>
+          <w:sz w:val="20"/>
+          <w:szCs w:val="20"/>
+        </w:rPr>
+        <w:tab/>
+      </w:r>
+      <w:r>
+        <w:rPr>
+          <w:sz w:val="20"/>
+          <w:szCs w:val="20"/>
+        </w:rPr>
+        <w:tab/>
+      </w:r>
+      <w:r>
+        <w:rPr>
+          <w:sz w:val="20"/>
+          <w:szCs w:val="20"/>
+        </w:rPr>
+        <w:tab/>
+      </w:r>
+      <w:r>
+        <w:rPr>
+          <w:sz w:val="20"/>
+          <w:szCs w:val="20"/>
+        </w:rPr>
+        <w:tab/>
+      </w:r>
+      <w:r>
+        <w:rPr>
+          <w:sz w:val="20"/>
+          <w:szCs w:val="20"/>
+        </w:rPr>
+        <w:tab/>
+        <w:t>8081,false),</w:t>
       </w:r>
     </w:p>
     <w:p>
@@ -2776,141 +1905,67 @@
           <w:szCs w:val="20"/>
         </w:rPr>
         <w:tab/>
-        <w:t xml:space="preserve">new </w:t>
-      </w:r>
-      <w:proofErr w:type="spellStart"/>
-      <w:proofErr w:type="gramStart"/>
-      <w:r>
-        <w:rPr>
-          <w:sz w:val="20"/>
-          <w:szCs w:val="20"/>
-        </w:rPr>
-        <w:t>DefaultServiceInstance</w:t>
-      </w:r>
-      <w:proofErr w:type="spellEnd"/>
-      <w:r>
-        <w:rPr>
-          <w:sz w:val="20"/>
-          <w:szCs w:val="20"/>
-        </w:rPr>
-        <w:t>(</w:t>
-      </w:r>
-      <w:proofErr w:type="spellStart"/>
-      <w:proofErr w:type="gramEnd"/>
-      <w:r>
-        <w:rPr>
-          <w:sz w:val="20"/>
-          <w:szCs w:val="20"/>
-        </w:rPr>
-        <w:t>serviceId</w:t>
-      </w:r>
-      <w:proofErr w:type="spellEnd"/>
-      <w:r>
-        <w:rPr>
-          <w:sz w:val="20"/>
-          <w:szCs w:val="20"/>
-        </w:rPr>
-        <w:t xml:space="preserve">+ "1", </w:t>
-      </w:r>
-      <w:proofErr w:type="spellStart"/>
-      <w:r>
-        <w:rPr>
-          <w:sz w:val="20"/>
-          <w:szCs w:val="20"/>
-        </w:rPr>
-        <w:t>serviceId</w:t>
-      </w:r>
-      <w:proofErr w:type="spellEnd"/>
-      <w:r>
-        <w:rPr>
-          <w:sz w:val="20"/>
-          <w:szCs w:val="20"/>
-        </w:rPr>
-        <w:t>,"localhost",</w:t>
-      </w:r>
-    </w:p>
-    <w:p>
-      <w:pPr>
-        <w:spacing w:after="0"/>
-        <w:rPr>
-          <w:sz w:val="20"/>
-          <w:szCs w:val="20"/>
-        </w:rPr>
-      </w:pPr>
-      <w:r>
-        <w:rPr>
-          <w:sz w:val="20"/>
-          <w:szCs w:val="20"/>
-        </w:rPr>
-        <w:tab/>
-      </w:r>
-      <w:r>
-        <w:rPr>
-          <w:sz w:val="20"/>
-          <w:szCs w:val="20"/>
-        </w:rPr>
-        <w:tab/>
-      </w:r>
-      <w:r>
-        <w:rPr>
-          <w:sz w:val="20"/>
-          <w:szCs w:val="20"/>
-        </w:rPr>
-        <w:tab/>
-      </w:r>
-      <w:r>
-        <w:rPr>
-          <w:sz w:val="20"/>
-          <w:szCs w:val="20"/>
-        </w:rPr>
-        <w:tab/>
-      </w:r>
-      <w:r>
-        <w:rPr>
-          <w:sz w:val="20"/>
-          <w:szCs w:val="20"/>
-        </w:rPr>
-        <w:tab/>
-      </w:r>
-      <w:r>
-        <w:rPr>
-          <w:sz w:val="20"/>
-          <w:szCs w:val="20"/>
-        </w:rPr>
-        <w:tab/>
-      </w:r>
-      <w:r>
-        <w:rPr>
-          <w:sz w:val="20"/>
-          <w:szCs w:val="20"/>
-        </w:rPr>
-        <w:tab/>
-      </w:r>
-      <w:proofErr w:type="gramStart"/>
-      <w:r>
-        <w:rPr>
-          <w:sz w:val="20"/>
-          <w:szCs w:val="20"/>
-        </w:rPr>
-        <w:t>7300,false</w:t>
-      </w:r>
-      <w:proofErr w:type="gramEnd"/>
-      <w:r>
-        <w:rPr>
-          <w:sz w:val="20"/>
-          <w:szCs w:val="20"/>
-        </w:rPr>
-        <w:t>))</w:t>
-      </w:r>
-      <w:proofErr w:type="gramStart"/>
-      <w:r>
-        <w:rPr>
-          <w:sz w:val="20"/>
-          <w:szCs w:val="20"/>
-        </w:rPr>
-        <w:t>) ;</w:t>
-      </w:r>
-      <w:proofErr w:type="gramEnd"/>
+        <w:t>new DefaultServiceInstance(serviceId+ "1", serviceId,"localhost",</w:t>
+      </w:r>
+    </w:p>
+    <w:p>
+      <w:pPr>
+        <w:spacing w:after="0"/>
+        <w:rPr>
+          <w:sz w:val="20"/>
+          <w:szCs w:val="20"/>
+        </w:rPr>
+      </w:pPr>
+      <w:r>
+        <w:rPr>
+          <w:sz w:val="20"/>
+          <w:szCs w:val="20"/>
+        </w:rPr>
+        <w:tab/>
+      </w:r>
+      <w:r>
+        <w:rPr>
+          <w:sz w:val="20"/>
+          <w:szCs w:val="20"/>
+        </w:rPr>
+        <w:tab/>
+      </w:r>
+      <w:r>
+        <w:rPr>
+          <w:sz w:val="20"/>
+          <w:szCs w:val="20"/>
+        </w:rPr>
+        <w:tab/>
+      </w:r>
+      <w:r>
+        <w:rPr>
+          <w:sz w:val="20"/>
+          <w:szCs w:val="20"/>
+        </w:rPr>
+        <w:tab/>
+      </w:r>
+      <w:r>
+        <w:rPr>
+          <w:sz w:val="20"/>
+          <w:szCs w:val="20"/>
+        </w:rPr>
+        <w:tab/>
+      </w:r>
+      <w:r>
+        <w:rPr>
+          <w:sz w:val="20"/>
+          <w:szCs w:val="20"/>
+        </w:rPr>
+        <w:tab/>
+      </w:r>
+      <w:r>
+        <w:rPr>
+          <w:sz w:val="20"/>
+          <w:szCs w:val="20"/>
+        </w:rPr>
+        <w:tab/>
+        <w:t>7300,false))) ;</w:t>
+      </w:r>
     </w:p>
     <w:p>
       <w:pPr>
@@ -2990,79 +2045,38 @@
           <w:szCs w:val="20"/>
         </w:rPr>
         <w:tab/>
-        <w:t xml:space="preserve">public String </w:t>
-      </w:r>
-      <w:proofErr w:type="spellStart"/>
-      <w:proofErr w:type="gramStart"/>
-      <w:r>
-        <w:rPr>
-          <w:sz w:val="20"/>
-          <w:szCs w:val="20"/>
-        </w:rPr>
-        <w:t>getServiceId</w:t>
-      </w:r>
-      <w:proofErr w:type="spellEnd"/>
-      <w:r>
-        <w:rPr>
-          <w:sz w:val="20"/>
-          <w:szCs w:val="20"/>
-        </w:rPr>
-        <w:t>(</w:t>
-      </w:r>
-      <w:proofErr w:type="gramEnd"/>
-      <w:r>
-        <w:rPr>
-          <w:sz w:val="20"/>
-          <w:szCs w:val="20"/>
-        </w:rPr>
-        <w:t>) {</w:t>
-      </w:r>
-    </w:p>
-    <w:p>
-      <w:pPr>
-        <w:spacing w:after="0"/>
-        <w:rPr>
-          <w:sz w:val="20"/>
-          <w:szCs w:val="20"/>
-        </w:rPr>
-      </w:pPr>
-      <w:r>
-        <w:rPr>
-          <w:sz w:val="20"/>
-          <w:szCs w:val="20"/>
-        </w:rPr>
-        <w:tab/>
-      </w:r>
-      <w:r>
-        <w:rPr>
-          <w:sz w:val="20"/>
-          <w:szCs w:val="20"/>
-        </w:rPr>
-        <w:tab/>
-      </w:r>
-      <w:r>
-        <w:rPr>
-          <w:sz w:val="20"/>
-          <w:szCs w:val="20"/>
-        </w:rPr>
-        <w:tab/>
-        <w:t xml:space="preserve">return </w:t>
-      </w:r>
-      <w:proofErr w:type="spellStart"/>
-      <w:r>
-        <w:rPr>
-          <w:sz w:val="20"/>
-          <w:szCs w:val="20"/>
-        </w:rPr>
-        <w:t>serviceId</w:t>
-      </w:r>
-      <w:proofErr w:type="spellEnd"/>
-      <w:r>
-        <w:rPr>
-          <w:sz w:val="20"/>
-          <w:szCs w:val="20"/>
-        </w:rPr>
-        <w:t>;</w:t>
+        <w:t>public String getServiceId() {</w:t>
+      </w:r>
+    </w:p>
+    <w:p>
+      <w:pPr>
+        <w:spacing w:after="0"/>
+        <w:rPr>
+          <w:sz w:val="20"/>
+          <w:szCs w:val="20"/>
+        </w:rPr>
+      </w:pPr>
+      <w:r>
+        <w:rPr>
+          <w:sz w:val="20"/>
+          <w:szCs w:val="20"/>
+        </w:rPr>
+        <w:tab/>
+      </w:r>
+      <w:r>
+        <w:rPr>
+          <w:sz w:val="20"/>
+          <w:szCs w:val="20"/>
+        </w:rPr>
+        <w:tab/>
+      </w:r>
+      <w:r>
+        <w:rPr>
+          <w:sz w:val="20"/>
+          <w:szCs w:val="20"/>
+        </w:rPr>
+        <w:tab/>
+        <w:t>return serviceId;</w:t>
       </w:r>
     </w:p>
     <w:p>
@@ -3152,27 +2166,7 @@
     </w:p>
     <w:p>
       <w:r>
-        <w:t>@</w:t>
-      </w:r>
-      <w:proofErr w:type="gramStart"/>
-      <w:r>
-        <w:t>LoadBalancerClient(</w:t>
-      </w:r>
-      <w:proofErr w:type="gramEnd"/>
-      <w:r>
-        <w:t>name="MyloadBalancer</w:t>
-      </w:r>
-      <w:proofErr w:type="gramStart"/>
-      <w:r>
-        <w:t>" ,</w:t>
-      </w:r>
-      <w:proofErr w:type="gramEnd"/>
-      <w:r>
-        <w:t xml:space="preserve"> configuration=</w:t>
-      </w:r>
-      <w:proofErr w:type="spellStart"/>
-      <w:r>
-        <w:t>LoadBalancerConfig.</w:t>
+        <w:t>@LoadBalancerClient(name="MyloadBalancer" , configuration=LoadBalancerConfig.</w:t>
       </w:r>
       <w:r>
         <w:rPr>
@@ -3181,7 +2175,6 @@
         </w:rPr>
         <w:t>class</w:t>
       </w:r>
-      <w:proofErr w:type="spellEnd"/>
       <w:r>
         <w:t>)</w:t>
       </w:r>
@@ -3193,16 +2186,32 @@
       <w:r>
         <w:t xml:space="preserve"> </w:t>
       </w:r>
-      <w:proofErr w:type="spellStart"/>
-      <w:r>
-        <w:t>nane</w:t>
-      </w:r>
-      <w:proofErr w:type="spellEnd"/>
-      <w:r>
-        <w:t>.</w:t>
-      </w:r>
-    </w:p>
-    <w:p/>
+      <w:r>
+        <w:t>n</w:t>
+      </w:r>
+      <w:r>
+        <w:t>a</w:t>
+      </w:r>
+      <w:r>
+        <w:t>m</w:t>
+      </w:r>
+      <w:r>
+        <w:t>e.</w:t>
+      </w:r>
+    </w:p>
+    <w:p>
+      <w:r>
+        <w:t>Also,</w:t>
+      </w:r>
+      <w:r>
+        <w:br/>
+        <w:t>@Autowired</w:t>
+      </w:r>
+      <w:r>
+        <w:br/>
+        <w:t>RestTemplate restTemplate;</w:t>
+      </w:r>
+    </w:p>
     <w:p>
       <w:r>
         <w:t>Step 4 –</w:t>
@@ -3211,30 +2220,18 @@
     <w:p>
       <w:r>
         <w:t xml:space="preserve">List&lt;Integer&gt; friends = </w:t>
+      </w:r>
+      <w:r>
+        <w:t>restTemplate</w:t>
+      </w:r>
+      <w:r>
+        <w:t>.getForObject("http://MyloadBalancer"+"/customers/"+phoneNo+"/friends",List.</w:t>
       </w:r>
       <w:r>
         <w:rPr>
           <w:b/>
           <w:bCs/>
         </w:rPr>
-        <w:t>new</w:t>
-      </w:r>
-      <w:r>
-        <w:t xml:space="preserve"> RestTemplate(</w:t>
-      </w:r>
-      <w:proofErr w:type="gramStart"/>
-      <w:r>
-        <w:t>).getForObject</w:t>
-      </w:r>
-      <w:proofErr w:type="gramEnd"/>
-      <w:r>
-        <w:t>("http://MyloadBalancer"+"/customers/"+phoneNo+"/friends",List.</w:t>
-      </w:r>
-      <w:r>
-        <w:rPr>
-          <w:b/>
-          <w:bCs/>
-        </w:rPr>
         <w:t>class</w:t>
       </w:r>
       <w:r>
@@ -3244,23 +2241,7 @@
     <w:p/>
     <w:p>
       <w:r>
-        <w:t xml:space="preserve">Instead of the </w:t>
-      </w:r>
-      <w:proofErr w:type="spellStart"/>
-      <w:r>
-        <w:t>uri</w:t>
-      </w:r>
-      <w:proofErr w:type="spellEnd"/>
-      <w:r>
-        <w:t xml:space="preserve"> call this </w:t>
-      </w:r>
-      <w:proofErr w:type="spellStart"/>
-      <w:r>
-        <w:t>uru</w:t>
-      </w:r>
-      <w:proofErr w:type="spellEnd"/>
-      <w:r>
-        <w:t xml:space="preserve"> with the name same as in annotation in step 4.</w:t>
+        <w:t>Instead of the uri call this uru with the name same as in annotation in step 4.</w:t>
       </w:r>
     </w:p>
     <w:p/>
@@ -3284,18 +2265,1284 @@
         <w:t>DYNAMIC LOAD BALANCING</w:t>
       </w:r>
     </w:p>
+    <w:p>
+      <w:r>
+        <w:t>To implement Dynamic load balancing with consul and its service discovery following are the few steps.</w:t>
+      </w:r>
+    </w:p>
+    <w:p>
+      <w:r>
+        <w:t>But before that the idea is that instead of statically providing the host and port names to in as input the client will discover the same with the help of consul as consul holds the data for all of them.</w:t>
+      </w:r>
+    </w:p>
     <w:p/>
+    <w:p>
+      <w:r>
+        <w:t>Steps:</w:t>
+      </w:r>
+    </w:p>
+    <w:p>
+      <w:r>
+        <w:t xml:space="preserve">Step1: </w:t>
+      </w:r>
+    </w:p>
+    <w:p>
+      <w:r>
+        <w:lastRenderedPageBreak/>
+        <w:t>Create a configuration class that will return a load balance</w:t>
+      </w:r>
+      <w:r>
+        <w:t>d</w:t>
+      </w:r>
+      <w:r>
+        <w:t xml:space="preserve"> bean of RestTemplate</w:t>
+      </w:r>
+    </w:p>
     <w:p/>
+    <w:p>
+      <w:pPr>
+        <w:spacing w:after="0"/>
+        <w:rPr>
+          <w:sz w:val="20"/>
+          <w:szCs w:val="20"/>
+        </w:rPr>
+      </w:pPr>
+      <w:r>
+        <w:rPr>
+          <w:b/>
+          <w:bCs/>
+          <w:sz w:val="20"/>
+          <w:szCs w:val="20"/>
+        </w:rPr>
+        <w:t>package</w:t>
+      </w:r>
+      <w:r>
+        <w:rPr>
+          <w:sz w:val="20"/>
+          <w:szCs w:val="20"/>
+        </w:rPr>
+        <w:t xml:space="preserve"> com.infosys.infytel.customer;</w:t>
+      </w:r>
+    </w:p>
+    <w:p>
+      <w:pPr>
+        <w:spacing w:after="0"/>
+        <w:rPr>
+          <w:sz w:val="20"/>
+          <w:szCs w:val="20"/>
+        </w:rPr>
+      </w:pPr>
+    </w:p>
+    <w:p>
+      <w:pPr>
+        <w:spacing w:after="0"/>
+        <w:rPr>
+          <w:sz w:val="20"/>
+          <w:szCs w:val="20"/>
+        </w:rPr>
+      </w:pPr>
+      <w:r>
+        <w:rPr>
+          <w:b/>
+          <w:bCs/>
+          <w:sz w:val="20"/>
+          <w:szCs w:val="20"/>
+        </w:rPr>
+        <w:t>import</w:t>
+      </w:r>
+      <w:r>
+        <w:rPr>
+          <w:sz w:val="20"/>
+          <w:szCs w:val="20"/>
+        </w:rPr>
+        <w:t xml:space="preserve"> org.springframework.cloud.client.loadbalancer.LoadBalanced;</w:t>
+      </w:r>
+    </w:p>
+    <w:p>
+      <w:pPr>
+        <w:spacing w:after="0"/>
+        <w:rPr>
+          <w:sz w:val="20"/>
+          <w:szCs w:val="20"/>
+        </w:rPr>
+      </w:pPr>
+      <w:r>
+        <w:rPr>
+          <w:b/>
+          <w:bCs/>
+          <w:sz w:val="20"/>
+          <w:szCs w:val="20"/>
+        </w:rPr>
+        <w:t>import</w:t>
+      </w:r>
+      <w:r>
+        <w:rPr>
+          <w:sz w:val="20"/>
+          <w:szCs w:val="20"/>
+        </w:rPr>
+        <w:t xml:space="preserve"> org.springframework.context.annotation.Bean;</w:t>
+      </w:r>
+    </w:p>
+    <w:p>
+      <w:pPr>
+        <w:spacing w:after="0"/>
+        <w:rPr>
+          <w:sz w:val="20"/>
+          <w:szCs w:val="20"/>
+        </w:rPr>
+      </w:pPr>
+      <w:r>
+        <w:rPr>
+          <w:b/>
+          <w:bCs/>
+          <w:sz w:val="20"/>
+          <w:szCs w:val="20"/>
+        </w:rPr>
+        <w:t>import</w:t>
+      </w:r>
+      <w:r>
+        <w:rPr>
+          <w:sz w:val="20"/>
+          <w:szCs w:val="20"/>
+        </w:rPr>
+        <w:t xml:space="preserve"> org.springframework.context.annotation.Configuration;</w:t>
+      </w:r>
+    </w:p>
+    <w:p>
+      <w:pPr>
+        <w:spacing w:after="0"/>
+        <w:rPr>
+          <w:sz w:val="20"/>
+          <w:szCs w:val="20"/>
+        </w:rPr>
+      </w:pPr>
+      <w:r>
+        <w:rPr>
+          <w:b/>
+          <w:bCs/>
+          <w:sz w:val="20"/>
+          <w:szCs w:val="20"/>
+        </w:rPr>
+        <w:t>import</w:t>
+      </w:r>
+      <w:r>
+        <w:rPr>
+          <w:sz w:val="20"/>
+          <w:szCs w:val="20"/>
+        </w:rPr>
+        <w:t xml:space="preserve"> org.springframework.web.client.RestTemplate;</w:t>
+      </w:r>
+    </w:p>
+    <w:p>
+      <w:pPr>
+        <w:spacing w:after="0"/>
+        <w:rPr>
+          <w:sz w:val="20"/>
+          <w:szCs w:val="20"/>
+        </w:rPr>
+      </w:pPr>
+    </w:p>
+    <w:p>
+      <w:pPr>
+        <w:spacing w:after="0"/>
+        <w:rPr>
+          <w:sz w:val="20"/>
+          <w:szCs w:val="20"/>
+        </w:rPr>
+      </w:pPr>
+      <w:r>
+        <w:rPr>
+          <w:sz w:val="20"/>
+          <w:szCs w:val="20"/>
+        </w:rPr>
+        <w:t>@Configuration</w:t>
+      </w:r>
+    </w:p>
+    <w:p>
+      <w:pPr>
+        <w:spacing w:after="0"/>
+        <w:rPr>
+          <w:sz w:val="20"/>
+          <w:szCs w:val="20"/>
+        </w:rPr>
+      </w:pPr>
+      <w:r>
+        <w:rPr>
+          <w:b/>
+          <w:bCs/>
+          <w:sz w:val="20"/>
+          <w:szCs w:val="20"/>
+        </w:rPr>
+        <w:t>public</w:t>
+      </w:r>
+      <w:r>
+        <w:rPr>
+          <w:sz w:val="20"/>
+          <w:szCs w:val="20"/>
+        </w:rPr>
+        <w:t xml:space="preserve"> </w:t>
+      </w:r>
+      <w:r>
+        <w:rPr>
+          <w:b/>
+          <w:bCs/>
+          <w:sz w:val="20"/>
+          <w:szCs w:val="20"/>
+        </w:rPr>
+        <w:t>class</w:t>
+      </w:r>
+      <w:r>
+        <w:rPr>
+          <w:sz w:val="20"/>
+          <w:szCs w:val="20"/>
+        </w:rPr>
+        <w:t xml:space="preserve"> CustomerConfig {</w:t>
+      </w:r>
+    </w:p>
+    <w:p>
+      <w:pPr>
+        <w:spacing w:after="0"/>
+        <w:rPr>
+          <w:sz w:val="20"/>
+          <w:szCs w:val="20"/>
+        </w:rPr>
+      </w:pPr>
+    </w:p>
+    <w:p>
+      <w:pPr>
+        <w:spacing w:after="0"/>
+        <w:rPr>
+          <w:sz w:val="20"/>
+          <w:szCs w:val="20"/>
+        </w:rPr>
+      </w:pPr>
+      <w:r>
+        <w:rPr>
+          <w:sz w:val="20"/>
+          <w:szCs w:val="20"/>
+        </w:rPr>
+        <w:tab/>
+        <w:t xml:space="preserve">@Bean </w:t>
+      </w:r>
+    </w:p>
+    <w:p>
+      <w:pPr>
+        <w:spacing w:after="0"/>
+        <w:rPr>
+          <w:sz w:val="20"/>
+          <w:szCs w:val="20"/>
+        </w:rPr>
+      </w:pPr>
+      <w:r>
+        <w:rPr>
+          <w:sz w:val="20"/>
+          <w:szCs w:val="20"/>
+        </w:rPr>
+        <w:tab/>
+      </w:r>
+      <w:r>
+        <w:rPr>
+          <w:sz w:val="20"/>
+          <w:szCs w:val="20"/>
+          <w:highlight w:val="yellow"/>
+        </w:rPr>
+        <w:t>@LoadBalanced</w:t>
+      </w:r>
+    </w:p>
+    <w:p>
+      <w:pPr>
+        <w:spacing w:after="0"/>
+        <w:rPr>
+          <w:sz w:val="20"/>
+          <w:szCs w:val="20"/>
+        </w:rPr>
+      </w:pPr>
+      <w:r>
+        <w:rPr>
+          <w:sz w:val="20"/>
+          <w:szCs w:val="20"/>
+        </w:rPr>
+        <w:tab/>
+        <w:t>RestTemplate restTemplate() {</w:t>
+      </w:r>
+    </w:p>
+    <w:p>
+      <w:pPr>
+        <w:spacing w:after="0"/>
+        <w:rPr>
+          <w:sz w:val="20"/>
+          <w:szCs w:val="20"/>
+        </w:rPr>
+      </w:pPr>
+      <w:r>
+        <w:rPr>
+          <w:sz w:val="20"/>
+          <w:szCs w:val="20"/>
+        </w:rPr>
+        <w:tab/>
+      </w:r>
+      <w:r>
+        <w:rPr>
+          <w:sz w:val="20"/>
+          <w:szCs w:val="20"/>
+        </w:rPr>
+        <w:tab/>
+      </w:r>
+      <w:r>
+        <w:rPr>
+          <w:b/>
+          <w:bCs/>
+          <w:sz w:val="20"/>
+          <w:szCs w:val="20"/>
+        </w:rPr>
+        <w:t>return</w:t>
+      </w:r>
+      <w:r>
+        <w:rPr>
+          <w:sz w:val="20"/>
+          <w:szCs w:val="20"/>
+        </w:rPr>
+        <w:t xml:space="preserve"> </w:t>
+      </w:r>
+      <w:r>
+        <w:rPr>
+          <w:b/>
+          <w:bCs/>
+          <w:sz w:val="20"/>
+          <w:szCs w:val="20"/>
+        </w:rPr>
+        <w:t>new</w:t>
+      </w:r>
+      <w:r>
+        <w:rPr>
+          <w:sz w:val="20"/>
+          <w:szCs w:val="20"/>
+        </w:rPr>
+        <w:t xml:space="preserve"> RestTemplate();</w:t>
+      </w:r>
+    </w:p>
+    <w:p>
+      <w:pPr>
+        <w:spacing w:after="0"/>
+        <w:rPr>
+          <w:sz w:val="20"/>
+          <w:szCs w:val="20"/>
+        </w:rPr>
+      </w:pPr>
+      <w:r>
+        <w:rPr>
+          <w:sz w:val="20"/>
+          <w:szCs w:val="20"/>
+        </w:rPr>
+        <w:tab/>
+        <w:t>}</w:t>
+      </w:r>
+    </w:p>
+    <w:p>
+      <w:pPr>
+        <w:spacing w:after="0"/>
+        <w:rPr>
+          <w:sz w:val="20"/>
+          <w:szCs w:val="20"/>
+        </w:rPr>
+      </w:pPr>
+      <w:r>
+        <w:rPr>
+          <w:sz w:val="20"/>
+          <w:szCs w:val="20"/>
+        </w:rPr>
+        <w:t>}</w:t>
+      </w:r>
+    </w:p>
     <w:p/>
+    <w:p>
+      <w:r>
+        <w:t>Step 2:</w:t>
+      </w:r>
+      <w:r>
+        <w:br/>
+        <w:t>Autowire this restTemplate in the controller where the call to the other MicroService is to be made.</w:t>
+      </w:r>
+    </w:p>
+    <w:p>
+      <w:r>
+        <w:t>Step 3:</w:t>
+      </w:r>
+    </w:p>
+    <w:p>
+      <w:pPr>
+        <w:spacing w:after="0"/>
+        <w:rPr>
+          <w:sz w:val="20"/>
+          <w:szCs w:val="20"/>
+        </w:rPr>
+      </w:pPr>
+      <w:r>
+        <w:t>Look how to make the call to the infytel-friend-family</w:t>
+      </w:r>
+      <w:r>
+        <w:br/>
+      </w:r>
+      <w:r>
+        <w:br/>
+      </w:r>
+      <w:r>
+        <w:rPr>
+          <w:sz w:val="20"/>
+          <w:szCs w:val="20"/>
+          <w:u w:val="single"/>
+        </w:rPr>
+        <w:t>@RequestMapping(value="/customers/v3/{phoneNo}", method=RequestMethod.</w:t>
+      </w:r>
+      <w:r>
+        <w:rPr>
+          <w:b/>
+          <w:bCs/>
+          <w:i/>
+          <w:iCs/>
+          <w:sz w:val="20"/>
+          <w:szCs w:val="20"/>
+          <w:u w:val="single"/>
+        </w:rPr>
+        <w:t>GET</w:t>
+      </w:r>
+      <w:r>
+        <w:rPr>
+          <w:sz w:val="20"/>
+          <w:szCs w:val="20"/>
+          <w:u w:val="single"/>
+        </w:rPr>
+        <w:t>, produces = MediaType.</w:t>
+      </w:r>
+      <w:r>
+        <w:rPr>
+          <w:b/>
+          <w:bCs/>
+          <w:i/>
+          <w:iCs/>
+          <w:sz w:val="20"/>
+          <w:szCs w:val="20"/>
+          <w:u w:val="single"/>
+        </w:rPr>
+        <w:t>APPLICATION_JSON_VALUE</w:t>
+      </w:r>
+      <w:r>
+        <w:rPr>
+          <w:sz w:val="20"/>
+          <w:szCs w:val="20"/>
+          <w:u w:val="single"/>
+        </w:rPr>
+        <w:t>)</w:t>
+      </w:r>
+    </w:p>
+    <w:p>
+      <w:pPr>
+        <w:spacing w:after="0"/>
+        <w:rPr>
+          <w:sz w:val="20"/>
+          <w:szCs w:val="20"/>
+        </w:rPr>
+      </w:pPr>
+      <w:r>
+        <w:rPr>
+          <w:sz w:val="20"/>
+          <w:szCs w:val="20"/>
+        </w:rPr>
+        <w:tab/>
+      </w:r>
+      <w:r>
+        <w:rPr>
+          <w:b/>
+          <w:bCs/>
+          <w:sz w:val="20"/>
+          <w:szCs w:val="20"/>
+        </w:rPr>
+        <w:t>public</w:t>
+      </w:r>
+      <w:r>
+        <w:rPr>
+          <w:sz w:val="20"/>
+          <w:szCs w:val="20"/>
+        </w:rPr>
+        <w:t xml:space="preserve"> CustomerDTO getCustomerProfilev3(@PathVariable Long phoneNo) {</w:t>
+      </w:r>
+    </w:p>
+    <w:p>
+      <w:pPr>
+        <w:spacing w:after="0"/>
+        <w:rPr>
+          <w:sz w:val="20"/>
+          <w:szCs w:val="20"/>
+        </w:rPr>
+      </w:pPr>
+      <w:r>
+        <w:rPr>
+          <w:sz w:val="20"/>
+          <w:szCs w:val="20"/>
+        </w:rPr>
+        <w:tab/>
+      </w:r>
+      <w:r>
+        <w:rPr>
+          <w:sz w:val="20"/>
+          <w:szCs w:val="20"/>
+        </w:rPr>
+        <w:tab/>
+        <w:t>logger.info("V3 getCustomerProfilev3 Invoked") ;</w:t>
+      </w:r>
+    </w:p>
+    <w:p>
+      <w:pPr>
+        <w:spacing w:after="0"/>
+        <w:rPr>
+          <w:sz w:val="20"/>
+          <w:szCs w:val="20"/>
+        </w:rPr>
+      </w:pPr>
+      <w:r>
+        <w:rPr>
+          <w:sz w:val="20"/>
+          <w:szCs w:val="20"/>
+        </w:rPr>
+        <w:tab/>
+      </w:r>
+      <w:r>
+        <w:rPr>
+          <w:sz w:val="20"/>
+          <w:szCs w:val="20"/>
+        </w:rPr>
+        <w:tab/>
+        <w:t>logger.info("phoneNo");</w:t>
+      </w:r>
+    </w:p>
+    <w:p>
+      <w:pPr>
+        <w:spacing w:after="0"/>
+        <w:rPr>
+          <w:sz w:val="20"/>
+          <w:szCs w:val="20"/>
+        </w:rPr>
+      </w:pPr>
+      <w:r>
+        <w:rPr>
+          <w:sz w:val="20"/>
+          <w:szCs w:val="20"/>
+        </w:rPr>
+        <w:tab/>
+      </w:r>
+      <w:r>
+        <w:rPr>
+          <w:sz w:val="20"/>
+          <w:szCs w:val="20"/>
+        </w:rPr>
+        <w:tab/>
+        <w:t>logger.info("Profile Request for customer" + phoneNo) ;</w:t>
+      </w:r>
+    </w:p>
+    <w:p>
+      <w:pPr>
+        <w:spacing w:after="0"/>
+        <w:rPr>
+          <w:sz w:val="20"/>
+          <w:szCs w:val="20"/>
+        </w:rPr>
+      </w:pPr>
+      <w:r>
+        <w:rPr>
+          <w:sz w:val="20"/>
+          <w:szCs w:val="20"/>
+        </w:rPr>
+        <w:tab/>
+      </w:r>
+      <w:r>
+        <w:rPr>
+          <w:sz w:val="20"/>
+          <w:szCs w:val="20"/>
+        </w:rPr>
+        <w:tab/>
+        <w:t>CustomerDTO custDTO = custService.getCustomerProfile(phoneNo) ;</w:t>
+      </w:r>
+    </w:p>
+    <w:p>
+      <w:pPr>
+        <w:spacing w:after="0"/>
+        <w:rPr>
+          <w:sz w:val="20"/>
+          <w:szCs w:val="20"/>
+        </w:rPr>
+      </w:pPr>
+      <w:r>
+        <w:rPr>
+          <w:strike/>
+          <w:sz w:val="20"/>
+          <w:szCs w:val="20"/>
+        </w:rPr>
+        <w:t>//</w:t>
+      </w:r>
+      <w:r>
+        <w:rPr>
+          <w:strike/>
+          <w:sz w:val="20"/>
+          <w:szCs w:val="20"/>
+        </w:rPr>
+        <w:tab/>
+      </w:r>
+      <w:r>
+        <w:rPr>
+          <w:strike/>
+          <w:sz w:val="20"/>
+          <w:szCs w:val="20"/>
+        </w:rPr>
+        <w:tab/>
+        <w:t>PlanDTO planDTO = new RestTemplate().getForObject(planUri + custDTO.getCurrentPlan().getPlanId(), PlanDTO.class)</w:t>
+      </w:r>
+      <w:r>
+        <w:rPr>
+          <w:sz w:val="20"/>
+          <w:szCs w:val="20"/>
+        </w:rPr>
+        <w:t xml:space="preserve"> ;</w:t>
+      </w:r>
+    </w:p>
+    <w:p>
+      <w:pPr>
+        <w:spacing w:after="0"/>
+        <w:rPr>
+          <w:sz w:val="20"/>
+          <w:szCs w:val="20"/>
+        </w:rPr>
+      </w:pPr>
+      <w:r>
+        <w:rPr>
+          <w:sz w:val="20"/>
+          <w:szCs w:val="20"/>
+        </w:rPr>
+        <w:tab/>
+      </w:r>
+      <w:r>
+        <w:rPr>
+          <w:sz w:val="20"/>
+          <w:szCs w:val="20"/>
+        </w:rPr>
+        <w:tab/>
+        <w:t>List&lt;ServiceInstance&gt; planInstance=client.getInstances("infytel-plan");</w:t>
+      </w:r>
+    </w:p>
+    <w:p>
+      <w:pPr>
+        <w:spacing w:after="0"/>
+        <w:rPr>
+          <w:sz w:val="20"/>
+          <w:szCs w:val="20"/>
+        </w:rPr>
+      </w:pPr>
+      <w:r>
+        <w:rPr>
+          <w:sz w:val="20"/>
+          <w:szCs w:val="20"/>
+        </w:rPr>
+        <w:tab/>
+      </w:r>
+      <w:r>
+        <w:rPr>
+          <w:sz w:val="20"/>
+          <w:szCs w:val="20"/>
+        </w:rPr>
+        <w:tab/>
+      </w:r>
+      <w:r>
+        <w:rPr>
+          <w:b/>
+          <w:bCs/>
+          <w:sz w:val="20"/>
+          <w:szCs w:val="20"/>
+        </w:rPr>
+        <w:t>if</w:t>
+      </w:r>
+      <w:r>
+        <w:rPr>
+          <w:sz w:val="20"/>
+          <w:szCs w:val="20"/>
+        </w:rPr>
+        <w:t>(planInstance!=</w:t>
+      </w:r>
+      <w:r>
+        <w:rPr>
+          <w:b/>
+          <w:bCs/>
+          <w:sz w:val="20"/>
+          <w:szCs w:val="20"/>
+        </w:rPr>
+        <w:t>null</w:t>
+      </w:r>
+      <w:r>
+        <w:rPr>
+          <w:sz w:val="20"/>
+          <w:szCs w:val="20"/>
+        </w:rPr>
+        <w:t xml:space="preserve"> &amp;&amp; !planInstance.isEmpty()) {</w:t>
+      </w:r>
+    </w:p>
+    <w:p>
+      <w:pPr>
+        <w:spacing w:after="0"/>
+        <w:rPr>
+          <w:sz w:val="20"/>
+          <w:szCs w:val="20"/>
+        </w:rPr>
+      </w:pPr>
+      <w:r>
+        <w:rPr>
+          <w:sz w:val="20"/>
+          <w:szCs w:val="20"/>
+        </w:rPr>
+        <w:tab/>
+      </w:r>
+      <w:r>
+        <w:rPr>
+          <w:sz w:val="20"/>
+          <w:szCs w:val="20"/>
+        </w:rPr>
+        <w:tab/>
+      </w:r>
+      <w:r>
+        <w:rPr>
+          <w:sz w:val="20"/>
+          <w:szCs w:val="20"/>
+        </w:rPr>
+        <w:tab/>
+        <w:t>planUri = planInstance.get(0).getUri().toString() ;</w:t>
+      </w:r>
+    </w:p>
+    <w:p>
+      <w:pPr>
+        <w:spacing w:after="0"/>
+        <w:rPr>
+          <w:sz w:val="20"/>
+          <w:szCs w:val="20"/>
+        </w:rPr>
+      </w:pPr>
+      <w:r>
+        <w:rPr>
+          <w:sz w:val="20"/>
+          <w:szCs w:val="20"/>
+        </w:rPr>
+        <w:tab/>
+      </w:r>
+      <w:r>
+        <w:rPr>
+          <w:sz w:val="20"/>
+          <w:szCs w:val="20"/>
+        </w:rPr>
+        <w:tab/>
+        <w:t>}</w:t>
+      </w:r>
+    </w:p>
+    <w:p>
+      <w:pPr>
+        <w:spacing w:after="0"/>
+        <w:rPr>
+          <w:sz w:val="20"/>
+          <w:szCs w:val="20"/>
+        </w:rPr>
+      </w:pPr>
+      <w:r>
+        <w:rPr>
+          <w:sz w:val="20"/>
+          <w:szCs w:val="20"/>
+        </w:rPr>
+        <w:tab/>
+      </w:r>
+      <w:r>
+        <w:rPr>
+          <w:sz w:val="20"/>
+          <w:szCs w:val="20"/>
+        </w:rPr>
+        <w:tab/>
+        <w:t xml:space="preserve">PlanDTO planDTO = </w:t>
+      </w:r>
+      <w:r>
+        <w:rPr>
+          <w:b/>
+          <w:bCs/>
+          <w:sz w:val="20"/>
+          <w:szCs w:val="20"/>
+        </w:rPr>
+        <w:t>new</w:t>
+      </w:r>
+      <w:r>
+        <w:rPr>
+          <w:sz w:val="20"/>
+          <w:szCs w:val="20"/>
+        </w:rPr>
+        <w:t xml:space="preserve"> RestTemplate().getForObject(planUri+"/plans/" + custDTO.getCurrentPlan().getPlanId(), PlanDTO.</w:t>
+      </w:r>
+      <w:r>
+        <w:rPr>
+          <w:b/>
+          <w:bCs/>
+          <w:sz w:val="20"/>
+          <w:szCs w:val="20"/>
+        </w:rPr>
+        <w:t>class</w:t>
+      </w:r>
+      <w:r>
+        <w:rPr>
+          <w:sz w:val="20"/>
+          <w:szCs w:val="20"/>
+        </w:rPr>
+        <w:t>) ;</w:t>
+      </w:r>
+    </w:p>
+    <w:p>
+      <w:pPr>
+        <w:spacing w:after="0"/>
+        <w:rPr>
+          <w:sz w:val="20"/>
+          <w:szCs w:val="20"/>
+        </w:rPr>
+      </w:pPr>
+      <w:r>
+        <w:rPr>
+          <w:sz w:val="20"/>
+          <w:szCs w:val="20"/>
+        </w:rPr>
+        <w:tab/>
+      </w:r>
+      <w:r>
+        <w:rPr>
+          <w:sz w:val="20"/>
+          <w:szCs w:val="20"/>
+        </w:rPr>
+        <w:tab/>
+        <w:t>custDTO.setCurrentPlan(planDTO);</w:t>
+      </w:r>
+    </w:p>
+    <w:p>
+      <w:pPr>
+        <w:spacing w:after="0"/>
+        <w:rPr>
+          <w:sz w:val="20"/>
+          <w:szCs w:val="20"/>
+        </w:rPr>
+      </w:pPr>
+      <w:r>
+        <w:rPr>
+          <w:sz w:val="20"/>
+          <w:szCs w:val="20"/>
+        </w:rPr>
+        <w:tab/>
+      </w:r>
+      <w:r>
+        <w:rPr>
+          <w:sz w:val="20"/>
+          <w:szCs w:val="20"/>
+        </w:rPr>
+        <w:tab/>
+        <w:t>logger.info(planDTO);</w:t>
+      </w:r>
+    </w:p>
+    <w:p>
+      <w:pPr>
+        <w:spacing w:after="0"/>
+        <w:rPr>
+          <w:sz w:val="20"/>
+          <w:szCs w:val="20"/>
+        </w:rPr>
+      </w:pPr>
+      <w:r>
+        <w:rPr>
+          <w:sz w:val="20"/>
+          <w:szCs w:val="20"/>
+        </w:rPr>
+        <w:tab/>
+      </w:r>
+      <w:r>
+        <w:rPr>
+          <w:sz w:val="20"/>
+          <w:szCs w:val="20"/>
+        </w:rPr>
+        <w:tab/>
+      </w:r>
+    </w:p>
+    <w:p>
+      <w:pPr>
+        <w:spacing w:after="0"/>
+        <w:rPr>
+          <w:sz w:val="20"/>
+          <w:szCs w:val="20"/>
+        </w:rPr>
+      </w:pPr>
+      <w:r>
+        <w:rPr>
+          <w:sz w:val="20"/>
+          <w:szCs w:val="20"/>
+        </w:rPr>
+        <w:tab/>
+      </w:r>
+      <w:r>
+        <w:rPr>
+          <w:sz w:val="20"/>
+          <w:szCs w:val="20"/>
+        </w:rPr>
+        <w:tab/>
+        <w:t>@SuppressWarnings("unchecked")</w:t>
+      </w:r>
+    </w:p>
+    <w:p>
+      <w:pPr>
+        <w:spacing w:after="0"/>
+        <w:rPr>
+          <w:sz w:val="20"/>
+          <w:szCs w:val="20"/>
+        </w:rPr>
+      </w:pPr>
+      <w:r>
+        <w:rPr>
+          <w:sz w:val="20"/>
+          <w:szCs w:val="20"/>
+        </w:rPr>
+        <w:lastRenderedPageBreak/>
+        <w:t>List&lt;Integer&gt; friends = restTemplate.getForObject("http://</w:t>
+      </w:r>
+      <w:r>
+        <w:rPr>
+          <w:sz w:val="20"/>
+          <w:szCs w:val="20"/>
+          <w:highlight w:val="yellow"/>
+        </w:rPr>
+        <w:t>infytel-friend-family</w:t>
+      </w:r>
+      <w:r>
+        <w:rPr>
+          <w:sz w:val="20"/>
+          <w:szCs w:val="20"/>
+        </w:rPr>
+        <w:t>/customers/"+phoneNo+"/friends", List.</w:t>
+      </w:r>
+      <w:r>
+        <w:rPr>
+          <w:b/>
+          <w:bCs/>
+          <w:sz w:val="20"/>
+          <w:szCs w:val="20"/>
+        </w:rPr>
+        <w:t>class</w:t>
+      </w:r>
+      <w:r>
+        <w:rPr>
+          <w:sz w:val="20"/>
+          <w:szCs w:val="20"/>
+        </w:rPr>
+        <w:t>) ;</w:t>
+      </w:r>
+    </w:p>
+    <w:p>
+      <w:pPr>
+        <w:spacing w:after="0"/>
+        <w:rPr>
+          <w:sz w:val="20"/>
+          <w:szCs w:val="20"/>
+        </w:rPr>
+      </w:pPr>
+      <w:r>
+        <w:rPr>
+          <w:sz w:val="20"/>
+          <w:szCs w:val="20"/>
+        </w:rPr>
+        <w:tab/>
+      </w:r>
+      <w:r>
+        <w:rPr>
+          <w:sz w:val="20"/>
+          <w:szCs w:val="20"/>
+        </w:rPr>
+        <w:tab/>
+        <w:t>logger.info(" Retrieved :::::: "+ friends) ;</w:t>
+      </w:r>
+    </w:p>
+    <w:p>
+      <w:pPr>
+        <w:spacing w:after="0"/>
+        <w:rPr>
+          <w:sz w:val="20"/>
+          <w:szCs w:val="20"/>
+        </w:rPr>
+      </w:pPr>
+      <w:r>
+        <w:rPr>
+          <w:sz w:val="20"/>
+          <w:szCs w:val="20"/>
+        </w:rPr>
+        <w:tab/>
+      </w:r>
+      <w:r>
+        <w:rPr>
+          <w:sz w:val="20"/>
+          <w:szCs w:val="20"/>
+        </w:rPr>
+        <w:tab/>
+        <w:t>List&lt;Long&gt; friendsList= friends.stream().map(f-&gt; {</w:t>
+      </w:r>
+      <w:r>
+        <w:rPr>
+          <w:b/>
+          <w:bCs/>
+          <w:sz w:val="20"/>
+          <w:szCs w:val="20"/>
+        </w:rPr>
+        <w:t>return</w:t>
+      </w:r>
+      <w:r>
+        <w:rPr>
+          <w:sz w:val="20"/>
+          <w:szCs w:val="20"/>
+        </w:rPr>
+        <w:t xml:space="preserve"> Long.</w:t>
+      </w:r>
+      <w:r>
+        <w:rPr>
+          <w:i/>
+          <w:iCs/>
+          <w:sz w:val="20"/>
+          <w:szCs w:val="20"/>
+        </w:rPr>
+        <w:t>valueOf</w:t>
+      </w:r>
+      <w:r>
+        <w:rPr>
+          <w:sz w:val="20"/>
+          <w:szCs w:val="20"/>
+        </w:rPr>
+        <w:t>(f) ;}).collect(Collectors.</w:t>
+      </w:r>
+      <w:r>
+        <w:rPr>
+          <w:i/>
+          <w:iCs/>
+          <w:sz w:val="20"/>
+          <w:szCs w:val="20"/>
+        </w:rPr>
+        <w:t>toList</w:t>
+      </w:r>
+      <w:r>
+        <w:rPr>
+          <w:sz w:val="20"/>
+          <w:szCs w:val="20"/>
+        </w:rPr>
+        <w:t>()) ;</w:t>
+      </w:r>
+    </w:p>
+    <w:p>
+      <w:pPr>
+        <w:spacing w:after="0"/>
+        <w:rPr>
+          <w:sz w:val="20"/>
+          <w:szCs w:val="20"/>
+        </w:rPr>
+      </w:pPr>
+      <w:r>
+        <w:rPr>
+          <w:sz w:val="20"/>
+          <w:szCs w:val="20"/>
+        </w:rPr>
+        <w:tab/>
+      </w:r>
+      <w:r>
+        <w:rPr>
+          <w:sz w:val="20"/>
+          <w:szCs w:val="20"/>
+        </w:rPr>
+        <w:tab/>
+        <w:t>logger.info("friendsList :" + friendsList) ;</w:t>
+      </w:r>
+    </w:p>
+    <w:p>
+      <w:pPr>
+        <w:spacing w:after="0"/>
+        <w:rPr>
+          <w:sz w:val="20"/>
+          <w:szCs w:val="20"/>
+        </w:rPr>
+      </w:pPr>
+      <w:r>
+        <w:rPr>
+          <w:sz w:val="20"/>
+          <w:szCs w:val="20"/>
+        </w:rPr>
+        <w:tab/>
+      </w:r>
+      <w:r>
+        <w:rPr>
+          <w:sz w:val="20"/>
+          <w:szCs w:val="20"/>
+        </w:rPr>
+        <w:tab/>
+        <w:t>custDTO.setFriendAndFamily(friendsList) ;</w:t>
+      </w:r>
+    </w:p>
+    <w:p>
+      <w:pPr>
+        <w:spacing w:after="0"/>
+        <w:rPr>
+          <w:sz w:val="20"/>
+          <w:szCs w:val="20"/>
+        </w:rPr>
+      </w:pPr>
+      <w:r>
+        <w:rPr>
+          <w:sz w:val="20"/>
+          <w:szCs w:val="20"/>
+        </w:rPr>
+        <w:tab/>
+      </w:r>
+      <w:r>
+        <w:rPr>
+          <w:sz w:val="20"/>
+          <w:szCs w:val="20"/>
+        </w:rPr>
+        <w:tab/>
+        <w:t>logger.info("About to return DTO: " + custDTO);</w:t>
+      </w:r>
+    </w:p>
+    <w:p>
+      <w:pPr>
+        <w:spacing w:after="0"/>
+        <w:rPr>
+          <w:sz w:val="20"/>
+          <w:szCs w:val="20"/>
+        </w:rPr>
+      </w:pPr>
+      <w:r>
+        <w:rPr>
+          <w:sz w:val="20"/>
+          <w:szCs w:val="20"/>
+        </w:rPr>
+        <w:tab/>
+      </w:r>
+      <w:r>
+        <w:rPr>
+          <w:sz w:val="20"/>
+          <w:szCs w:val="20"/>
+        </w:rPr>
+        <w:tab/>
+      </w:r>
+      <w:r>
+        <w:rPr>
+          <w:b/>
+          <w:bCs/>
+          <w:sz w:val="20"/>
+          <w:szCs w:val="20"/>
+        </w:rPr>
+        <w:t>return</w:t>
+      </w:r>
+      <w:r>
+        <w:rPr>
+          <w:sz w:val="20"/>
+          <w:szCs w:val="20"/>
+        </w:rPr>
+        <w:t xml:space="preserve"> custDTO ;</w:t>
+      </w:r>
+    </w:p>
+    <w:p>
+      <w:pPr>
+        <w:spacing w:after="0"/>
+        <w:rPr>
+          <w:sz w:val="20"/>
+          <w:szCs w:val="20"/>
+        </w:rPr>
+      </w:pPr>
+      <w:r>
+        <w:rPr>
+          <w:sz w:val="20"/>
+          <w:szCs w:val="20"/>
+        </w:rPr>
+        <w:tab/>
+        <w:t>}</w:t>
+      </w:r>
+    </w:p>
     <w:p/>
+    <w:p>
+      <w:r>
+        <w:t>Replace the uri with the spring-application-name. This is enough to loadbalance the requests to the instances of the Service.</w:t>
+      </w:r>
+    </w:p>
+    <w:p>
+      <w:r>
+        <w:t>Step 4:</w:t>
+      </w:r>
+    </w:p>
+    <w:p>
+      <w:r>
+        <w:t xml:space="preserve">No extra dependency is needed for this. </w:t>
+      </w:r>
+      <w:r>
+        <w:rPr>
+          <w:b/>
+          <w:bCs/>
+        </w:rPr>
+        <w:t>N</w:t>
+      </w:r>
+      <w:r>
+        <w:rPr>
+          <w:b/>
+          <w:bCs/>
+        </w:rPr>
+        <w:t>OT NEEDED</w:t>
+      </w:r>
+      <w:r>
+        <w:t xml:space="preserve"> even the </w:t>
+      </w:r>
+    </w:p>
+    <w:p>
+      <w:pPr>
+        <w:spacing w:after="0"/>
+      </w:pPr>
+      <w:r>
+        <w:t>&lt;dependency&gt;</w:t>
+      </w:r>
+    </w:p>
+    <w:p>
+      <w:pPr>
+        <w:spacing w:after="0"/>
+      </w:pPr>
+      <w:r>
+        <w:tab/>
+        <w:t>&lt;groupId&gt;org.springframework.cloud&lt;/groupId&gt;</w:t>
+      </w:r>
+    </w:p>
+    <w:p>
+      <w:pPr>
+        <w:spacing w:after="0"/>
+      </w:pPr>
+      <w:r>
+        <w:tab/>
+        <w:t>&lt;artifactId&gt;spring-cloud-starter-loadbalancer&lt;/artifactId&gt;</w:t>
+      </w:r>
+    </w:p>
+    <w:p>
+      <w:pPr>
+        <w:spacing w:after="0"/>
+      </w:pPr>
+      <w:r>
+        <w:tab/>
+        <w:t>&lt;version&gt;5.0.0&lt;/version&gt;</w:t>
+      </w:r>
+    </w:p>
+    <w:p>
+      <w:pPr>
+        <w:spacing w:after="0"/>
+      </w:pPr>
+      <w:r>
+        <w:t xml:space="preserve">&lt;/dependency&gt; </w:t>
+      </w:r>
+    </w:p>
     <w:p/>
-    <w:p/>
-    <w:p/>
-    <w:p/>
-    <w:p/>
-    <w:p/>
-    <w:p/>
-    <w:p/>
+    <w:p>
+      <w:r>
+        <w:t>--------------------------------------------------------------------------------------------------------------------------</w:t>
+      </w:r>
+    </w:p>
     <w:p/>
     <w:p/>
     <w:sectPr>

</xml_diff>